<commit_message>
Update resume with reviewed research experience and Palo Alto contact location
</commit_message>
<xml_diff>
--- a/static/uploads/resume.docx
+++ b/static/uploads/resume.docx
@@ -6,7 +6,7 @@
       <w:pPr>
         <w:keepNext w:val="0"/>
         <w:pageBreakBefore w:val="0"/>
-        <w:spacing w:after="24" w:before="0" w:line="240" w:lineRule="auto"/>
+        <w:spacing w:after="20" w:before="0" w:line="240" w:lineRule="auto"/>
         <w:rPr/>
       </w:pPr>
       <w:r>
@@ -31,9 +31,21 @@
     </w:p>
     <w:p>
       <w:pPr>
+        <w:spacing w:after="20" w:line="240" w:lineRule="auto"/>
+      </w:pPr>
+      <w:r>
+        <w:rPr>
+          <w:b/>
+          <w:sz w:val="20"/>
+        </w:rPr>
+        <w:t>Robotics &amp; Autonomy | Robot Learning • Scene Understanding • Loco-Manipulation</w:t>
+      </w:r>
+    </w:p>
+    <w:p>
+      <w:pPr>
         <w:keepNext w:val="0"/>
         <w:pageBreakBefore w:val="0"/>
-        <w:spacing w:after="44" w:before="0" w:line="240" w:lineRule="auto"/>
+        <w:spacing w:after="20" w:before="0" w:line="240" w:lineRule="auto"/>
         <w:rPr/>
       </w:pPr>
       <w:r>
@@ -47,7 +59,7 @@
           <w:szCs w:val="19"/>
           <w:rtl w:val="0"/>
         </w:rPr>
-        <w:t xml:space="preserve">Stanford, CA  |  erwinpi@stanford.edu  |  +1 650 250 7491</w:t>
+        <w:t>Palo Alto, CA  |  erwinpi@stanford.edu  |  +1 650 250 7491</w:t>
       </w:r>
       <w:r>
         <w:rPr>
@@ -88,7 +100,7 @@
         <w:tabs>
           <w:tab w:val="right" w:leader="none" w:pos="11606"/>
         </w:tabs>
-        <w:spacing w:after="3" w:before="16" w:line="235" w:lineRule="auto"/>
+        <w:spacing w:after="20" w:before="16" w:line="240" w:lineRule="auto"/>
         <w:rPr/>
       </w:pPr>
       <w:r>
@@ -129,8 +141,6 @@
           <w:szCs w:val="20"/>
           <w:rtl w:val="0"/>
         </w:rPr>
-        <w:tab/>
-        <w:t xml:space="preserve">2025–2027 (expected)</w:t>
       </w:r>
       <w:r>
         <w:rPr>
@@ -145,7 +155,7 @@
         <w:tabs>
           <w:tab w:val="right" w:leader="none" w:pos="11606"/>
         </w:tabs>
-        <w:spacing w:after="3" w:before="7" w:line="235" w:lineRule="auto"/>
+        <w:spacing w:after="20" w:before="7" w:line="240" w:lineRule="auto"/>
         <w:rPr/>
       </w:pPr>
       <w:r>
@@ -173,7 +183,7 @@
       <w:pPr>
         <w:keepNext w:val="0"/>
         <w:pageBreakBefore w:val="0"/>
-        <w:spacing w:after="2" w:before="0" w:line="235" w:lineRule="auto"/>
+        <w:spacing w:after="20" w:before="0" w:line="240" w:lineRule="auto"/>
         <w:rPr>
           <w:i w:val="1"/>
           <w:iCs w:val="1"/>
@@ -218,7 +228,7 @@
         <w:tabs>
           <w:tab w:val="right" w:leader="none" w:pos="11606"/>
         </w:tabs>
-        <w:spacing w:after="3" w:before="16" w:line="235" w:lineRule="auto"/>
+        <w:spacing w:after="20" w:before="16" w:line="240" w:lineRule="auto"/>
         <w:rPr/>
       </w:pPr>
       <w:r>
@@ -259,8 +269,6 @@
           <w:szCs w:val="20"/>
           <w:rtl w:val="0"/>
         </w:rPr>
-        <w:tab/>
-        <w:t xml:space="preserve">2022–2025</w:t>
       </w:r>
       <w:r>
         <w:rPr>
@@ -275,7 +283,7 @@
         <w:tabs>
           <w:tab w:val="right" w:leader="none" w:pos="11606"/>
         </w:tabs>
-        <w:spacing w:after="3" w:before="7" w:line="235" w:lineRule="auto"/>
+        <w:spacing w:after="20" w:before="7" w:line="240" w:lineRule="auto"/>
         <w:rPr/>
       </w:pPr>
       <w:r>
@@ -289,161 +297,9 @@
           <w:szCs w:val="20"/>
           <w:rtl w:val="0"/>
         </w:rPr>
-        <w:t xml:space="preserve">M.Eng. in Mechanical Engineering; Autonomy concentration; Entrepreneurship minor.</w:t>
+        <w:t>M.Eng. in Computer Science &amp; Mechanical Engineering; Autonomy concentration; Entrepreneurship minor.</w:t>
         <w:tab/>
-        <w:t xml:space="preserve">GPA: 3.93/4.0</w:t>
-      </w:r>
-      <w:r>
-        <w:rPr>
-          <w:rtl w:val="0"/>
-        </w:rPr>
-      </w:r>
-    </w:p>
-    <w:p>
-      <w:pPr>
-        <w:keepNext w:val="1"/>
-        <w:pageBreakBefore w:val="0"/>
-        <w:tabs>
-          <w:tab w:val="right" w:leader="none" w:pos="11606"/>
-        </w:tabs>
-        <w:spacing w:after="3" w:before="16" w:line="235" w:lineRule="auto"/>
-        <w:rPr/>
-      </w:pPr>
-      <w:r>
-        <w:rPr>
-          <w:rFonts w:ascii="Calibri" w:cs="Calibri" w:eastAsia="Calibri" w:hAnsi="Calibri"/>
-          <w:b w:val="1"/>
-          <w:bCs w:val="1"/>
-          <w:i w:val="0"/>
-          <w:iCs w:val="0"/>
-          <w:sz w:val="20"/>
-          <w:szCs w:val="20"/>
-          <w:rtl w:val="0"/>
-        </w:rPr>
-        <w:t xml:space="preserve">Lycée Blaise Pascal</w:t>
-      </w:r>
-      <w:r>
-        <w:rPr>
-          <w:rFonts w:ascii="Calibri" w:cs="Calibri" w:eastAsia="Calibri" w:hAnsi="Calibri"/>
-          <w:b w:val="0"/>
-          <w:bCs w:val="0"/>
-          <w:i w:val="0"/>
-          <w:iCs w:val="0"/>
-          <w:sz w:val="20"/>
-          <w:szCs w:val="20"/>
-          <w:rtl w:val="0"/>
-        </w:rPr>
-        <w:t xml:space="preserve"> | </w:t>
-      </w:r>
-      <w:r>
-        <w:rPr>
-          <w:rtl w:val="0"/>
-        </w:rPr>
-        <w:t xml:space="preserve">Preparatory program -</w:t>
-      </w:r>
-      <w:r>
-        <w:rPr>
-          <w:rFonts w:ascii="Calibri" w:cs="Calibri" w:eastAsia="Calibri" w:hAnsi="Calibri"/>
-          <w:b w:val="0"/>
-          <w:bCs w:val="0"/>
-          <w:i w:val="0"/>
-          <w:iCs w:val="0"/>
-          <w:sz w:val="20"/>
-          <w:szCs w:val="20"/>
-          <w:rtl w:val="0"/>
-        </w:rPr>
-        <w:t xml:space="preserve">, Mathematics &amp; Physics; Clermont-Ferrand, France</w:t>
-      </w:r>
-      <w:r>
-        <w:rPr>
-          <w:rFonts w:ascii="Calibri" w:cs="Calibri" w:eastAsia="Calibri" w:hAnsi="Calibri"/>
-          <w:b w:val="0"/>
-          <w:bCs w:val="0"/>
-          <w:i w:val="0"/>
-          <w:iCs w:val="0"/>
-          <w:color w:val="4d555c"/>
-          <w:sz w:val="20"/>
-          <w:szCs w:val="20"/>
-          <w:rtl w:val="0"/>
-        </w:rPr>
-        <w:tab/>
-        <w:t xml:space="preserve">2020–2022</w:t>
-      </w:r>
-      <w:r>
-        <w:rPr>
-          <w:rtl w:val="0"/>
-        </w:rPr>
-      </w:r>
-    </w:p>
-    <w:p>
-      <w:pPr>
-        <w:keepNext w:val="1"/>
-        <w:pageBreakBefore w:val="0"/>
-        <w:tabs>
-          <w:tab w:val="right" w:leader="none" w:pos="11606"/>
-        </w:tabs>
-        <w:spacing w:after="3" w:before="16" w:line="235" w:lineRule="auto"/>
-        <w:rPr/>
-      </w:pPr>
-      <w:r>
-        <w:rPr>
-          <w:rFonts w:ascii="Calibri" w:cs="Calibri" w:eastAsia="Calibri" w:hAnsi="Calibri"/>
-          <w:b w:val="1"/>
-          <w:bCs w:val="1"/>
-          <w:i w:val="0"/>
-          <w:iCs w:val="0"/>
-          <w:sz w:val="20"/>
-          <w:szCs w:val="20"/>
-          <w:rtl w:val="0"/>
-        </w:rPr>
-        <w:t xml:space="preserve">Prytanée Militaire du Kadiogo (PMK)</w:t>
-      </w:r>
-      <w:r>
-        <w:rPr>
-          <w:rFonts w:ascii="Calibri" w:cs="Calibri" w:eastAsia="Calibri" w:hAnsi="Calibri"/>
-          <w:b w:val="0"/>
-          <w:bCs w:val="0"/>
-          <w:i w:val="0"/>
-          <w:iCs w:val="0"/>
-          <w:sz w:val="20"/>
-          <w:szCs w:val="20"/>
-          <w:rtl w:val="0"/>
-        </w:rPr>
-        <w:t xml:space="preserve"> | Military </w:t>
-      </w:r>
-      <w:r>
-        <w:rPr>
-          <w:rtl w:val="0"/>
-        </w:rPr>
-        <w:t xml:space="preserve">academy</w:t>
-      </w:r>
-      <w:r>
-        <w:rPr>
-          <w:rFonts w:ascii="Calibri" w:cs="Calibri" w:eastAsia="Calibri" w:hAnsi="Calibri"/>
-          <w:b w:val="0"/>
-          <w:bCs w:val="0"/>
-          <w:i w:val="0"/>
-          <w:iCs w:val="0"/>
-          <w:sz w:val="20"/>
-          <w:szCs w:val="20"/>
-          <w:rtl w:val="0"/>
-        </w:rPr>
-        <w:t xml:space="preserve">, Burkina Faso</w:t>
-      </w:r>
-      <w:r>
-        <w:rPr>
-          <w:rFonts w:ascii="Calibri" w:cs="Calibri" w:eastAsia="Calibri" w:hAnsi="Calibri"/>
-          <w:b w:val="0"/>
-          <w:bCs w:val="0"/>
-          <w:i w:val="0"/>
-          <w:iCs w:val="0"/>
-          <w:color w:val="4d555c"/>
-          <w:sz w:val="20"/>
-          <w:szCs w:val="20"/>
-          <w:rtl w:val="0"/>
-        </w:rPr>
-        <w:tab/>
-        <w:t xml:space="preserve">2013–2020</w:t>
+        <w:t>GPA: 3.93/4.0</w:t>
       </w:r>
       <w:r>
         <w:rPr>
@@ -464,17 +320,10 @@
       </w:pPr>
       <w:r>
         <w:rPr>
-          <w:rFonts w:ascii="Calibri" w:cs="Calibri" w:eastAsia="Calibri" w:hAnsi="Calibri"/>
-          <w:sz w:val="21"/>
-          <w:szCs w:val="21"/>
-          <w:rtl w:val="0"/>
+          <w:b/>
+          <w:sz w:val="20"/>
         </w:rPr>
-        <w:t xml:space="preserve">RESEARCH &amp; ENGINEERING</w:t>
-      </w:r>
-      <w:r>
-        <w:rPr>
-          <w:rtl w:val="0"/>
-        </w:rPr>
+        <w:t>WORK &amp; RESEARCH EXPERIENCE</w:t>
       </w:r>
     </w:p>
     <w:p>
@@ -484,103 +333,186 @@
         <w:tabs>
           <w:tab w:val="right" w:leader="none" w:pos="11606"/>
         </w:tabs>
-        <w:spacing w:after="3" w:before="16" w:line="235" w:lineRule="auto"/>
+        <w:spacing w:after="20" w:before="16" w:line="240" w:lineRule="auto"/>
         <w:rPr/>
       </w:pPr>
       <w:r>
         <w:rPr>
-          <w:rFonts w:ascii="Calibri" w:cs="Calibri" w:eastAsia="Calibri" w:hAnsi="Calibri"/>
-          <w:b w:val="1"/>
-          <w:bCs w:val="1"/>
-          <w:i w:val="0"/>
-          <w:iCs w:val="0"/>
+          <w:b/>
           <w:sz w:val="20"/>
-          <w:szCs w:val="20"/>
-          <w:rtl w:val="0"/>
         </w:rPr>
-        <w:t xml:space="preserve">Stanford University</w:t>
+        <w:t>Robotics Researcher — Robot Learning &amp; Autonomy</w:t>
       </w:r>
       <w:r>
         <w:rPr>
-          <w:rFonts w:ascii="Calibri" w:cs="Calibri" w:eastAsia="Calibri" w:hAnsi="Calibri"/>
-          <w:b w:val="0"/>
-          <w:bCs w:val="0"/>
-          <w:i w:val="0"/>
-          <w:iCs w:val="0"/>
           <w:sz w:val="20"/>
-          <w:szCs w:val="20"/>
-          <w:rtl w:val="0"/>
-        </w:rPr>
-        <w:t xml:space="preserve"> | Robotics Researcher</w:t>
-      </w:r>
-      <w:r>
-        <w:rPr>
-          <w:rFonts w:ascii="Calibri" w:cs="Calibri" w:eastAsia="Calibri" w:hAnsi="Calibri"/>
-          <w:b w:val="0"/>
-          <w:bCs w:val="0"/>
-          <w:i w:val="0"/>
-          <w:iCs w:val="0"/>
-          <w:color w:val="4d555c"/>
-          <w:sz w:val="20"/>
-          <w:szCs w:val="20"/>
-          <w:rtl w:val="0"/>
         </w:rPr>
         <w:tab/>
-        <w:t xml:space="preserve">2026–Present</w:t>
-      </w:r>
-      <w:r>
-        <w:rPr>
-          <w:rtl w:val="0"/>
-        </w:rPr>
+        <w:t>2026–Present</w:t>
       </w:r>
     </w:p>
     <w:p>
       <w:pPr>
         <w:keepNext w:val="1"/>
         <w:pageBreakBefore w:val="0"/>
-        <w:spacing w:after="6" w:before="0" w:line="235" w:lineRule="auto"/>
+        <w:spacing w:after="20" w:before="0" w:line="240" w:lineRule="auto"/>
         <w:rPr/>
       </w:pPr>
       <w:r>
         <w:rPr>
-          <w:rFonts w:ascii="Calibri" w:cs="Calibri" w:eastAsia="Calibri" w:hAnsi="Calibri"/>
-          <w:b w:val="0"/>
-          <w:bCs w:val="0"/>
-          <w:i w:val="1"/>
-          <w:iCs w:val="1"/>
-          <w:sz w:val="19"/>
-          <w:szCs w:val="19"/>
-          <w:rtl w:val="0"/>
+          <w:sz w:val="20"/>
         </w:rPr>
-        <w:t xml:space="preserve">Multi-Robot Systems Lab &amp; Autonomous Systems Lab — </w:t>
+        <w:t>Stanford University | Multi-Robot Systems Lab &amp; Autonomous Systems Lab</w:t>
+      </w:r>
+    </w:p>
+    <w:p>
+      <w:pPr>
+        <w:keepNext w:val="0"/>
+        <w:pageBreakBefore w:val="0"/>
+        <w:numPr>
+          <w:ilvl w:val="0"/>
+          <w:numId w:val="1"/>
+        </w:numPr>
+        <w:spacing w:after="20" w:before="0" w:line="240" w:lineRule="auto"/>
+        <w:ind w:left="122" w:hanging="122"/>
+        <w:rPr/>
+      </w:pPr>
+      <w:r>
+        <w:rPr>
+          <w:sz w:val="20"/>
+        </w:rPr>
+        <w:t xml:space="preserve">Generated synthetic data using RRT-planned trajectories in simulated 3D Gaussian Splatting environments and extended SINGER with goal-conditioned imitation learning (DAgger), improving sample efficiency and raising navigation success </w:t>
       </w:r>
       <w:r>
         <w:rPr>
-          <w:i w:val="1"/>
-          <w:iCs w:val="1"/>
-          <w:sz w:val="19"/>
-          <w:szCs w:val="19"/>
-          <w:rtl w:val="0"/>
+          <w:b/>
+          <w:sz w:val="20"/>
         </w:rPr>
-        <w:t xml:space="preserve">Drs</w:t>
+        <w:t>from 52% to 90%</w:t>
       </w:r>
       <w:r>
         <w:rPr>
-          <w:rFonts w:ascii="Calibri" w:cs="Calibri" w:eastAsia="Calibri" w:hAnsi="Calibri"/>
-          <w:b w:val="0"/>
-          <w:bCs w:val="0"/>
-          <w:i w:val="1"/>
-          <w:iCs w:val="1"/>
-          <w:sz w:val="19"/>
-          <w:szCs w:val="19"/>
-          <w:rtl w:val="0"/>
+          <w:sz w:val="20"/>
         </w:rPr>
-        <w:t xml:space="preserve">. Mac Schwager and Marco Pavone</w:t>
+        <w:t>.</w:t>
+      </w:r>
+      <w:r>
+        <w:t xml:space="preserve"> </w:t>
+      </w:r>
+      <w:hyperlink r:id="rId7">
+        <w:r>
+          <w:rPr>
+            <w:u w:val="single"/>
+            <w:color w:val="0563C1"/>
+            <w:sz w:val="20"/>
+            <w:u w:val="single"/>
+          </w:rPr>
+          <w:t>view work</w:t>
+        </w:r>
+      </w:hyperlink>
+    </w:p>
+    <w:p>
+      <w:pPr>
+        <w:spacing w:after="20" w:line="240" w:lineRule="auto"/>
+      </w:pPr>
+      <w:r>
+        <w:rPr>
+          <w:sz w:val="20"/>
+        </w:rPr>
+        <w:t>Developed GAIT for navigation toward language-specified targets, combining persistent scene memory with vision-language reasoning and motion planning; improved success while reducing reasoning calls and latency in controlled GOAT-Bench comparisons; working on sim-to-real transfer.</w:t>
+      </w:r>
+      <w:r>
+        <w:t xml:space="preserve"> </w:t>
+      </w:r>
+      <w:hyperlink r:id="rId14">
+        <w:r>
+          <w:rPr>
+            <w:u w:val="single"/>
+          </w:rPr>
+          <w:t>view work</w:t>
+        </w:r>
+      </w:hyperlink>
+    </w:p>
+    <w:p>
+      <w:pPr>
+        <w:keepNext w:val="1"/>
+        <w:pageBreakBefore w:val="0"/>
+        <w:numPr>
+          <w:ilvl w:val="0"/>
+          <w:numId w:val="1"/>
+        </w:numPr>
+        <w:spacing w:after="20" w:before="0" w:line="240" w:lineRule="auto"/>
+        <w:ind w:left="122" w:hanging="122"/>
+        <w:rPr/>
+      </w:pPr>
+      <w:r>
+        <w:rPr>
+          <w:sz w:val="20"/>
+        </w:rPr>
+        <w:t xml:space="preserve">Developing agentic robotics systems linking scene memory, grasping and whole-body motion planning for </w:t>
       </w:r>
       <w:r>
         <w:rPr>
-          <w:rtl w:val="0"/>
+          <w:b/>
+          <w:sz w:val="20"/>
         </w:rPr>
+        <w:t>G1 and Spot</w:t>
+      </w:r>
+      <w:r>
+        <w:rPr>
+          <w:sz w:val="20"/>
+        </w:rPr>
+        <w:t xml:space="preserve"> robots through DARPA TIAMAT, working on sim-to-real transfer for locomotion and manipulation.</w:t>
+      </w:r>
+      <w:r>
+        <w:t xml:space="preserve"> </w:t>
+      </w:r>
+      <w:hyperlink r:id="rId12">
+        <w:r>
+          <w:rPr>
+            <w:u w:val="single"/>
+            <w:color w:val="0563C1"/>
+            <w:sz w:val="20"/>
+            <w:u w:val="single"/>
+          </w:rPr>
+          <w:t>view work</w:t>
+        </w:r>
+      </w:hyperlink>
+    </w:p>
+    <w:p>
+      <w:pPr>
+        <w:keepNext w:val="1"/>
+        <w:pageBreakBefore w:val="0"/>
+        <w:tabs>
+          <w:tab w:val="right" w:leader="none" w:pos="11606"/>
+        </w:tabs>
+        <w:spacing w:after="20" w:before="16" w:line="240" w:lineRule="auto"/>
+        <w:rPr/>
+      </w:pPr>
+      <w:r>
+        <w:rPr>
+          <w:b/>
+          <w:sz w:val="20"/>
+        </w:rPr>
+        <w:t>AI Researcher — Reinforcement Learning &amp; Scientific Agents</w:t>
+      </w:r>
+      <w:r>
+        <w:rPr>
+          <w:sz w:val="20"/>
+        </w:rPr>
+        <w:tab/>
+        <w:t>Oct. 2025–Present</w:t>
+      </w:r>
+    </w:p>
+    <w:p>
+      <w:pPr>
+        <w:spacing w:after="20" w:line="240" w:lineRule="auto"/>
+      </w:pPr>
+      <w:r>
+        <w:rPr>
+          <w:sz w:val="20"/>
+        </w:rPr>
+        <w:t>Stanford School of Medicine | Qiu Lab</w:t>
       </w:r>
     </w:p>
     <w:p>
@@ -591,70 +523,76 @@
           <w:ilvl w:val="0"/>
           <w:numId w:val="1"/>
         </w:numPr>
-        <w:spacing w:after="4" w:before="0" w:line="235" w:lineRule="auto"/>
+        <w:spacing w:after="20" w:before="0" w:line="240" w:lineRule="auto"/>
         <w:ind w:left="122" w:hanging="122"/>
         <w:rPr/>
       </w:pPr>
       <w:r>
         <w:rPr>
-          <w:rFonts w:ascii="Calibri" w:cs="Calibri" w:eastAsia="Calibri" w:hAnsi="Calibri"/>
-          <w:b w:val="0"/>
-          <w:bCs w:val="0"/>
-          <w:i w:val="0"/>
-          <w:iCs w:val="0"/>
           <w:sz w:val="20"/>
-          <w:szCs w:val="20"/>
-          <w:rtl w:val="0"/>
         </w:rPr>
-        <w:t xml:space="preserve">Designing legged-robot systems linking scene memory, grasping and motion planning for </w:t>
+        <w:t xml:space="preserve">Formulated gene-panel selection as a sequential decision problem and developed </w:t>
       </w:r>
       <w:r>
         <w:rPr>
-          <w:rFonts w:ascii="Calibri" w:cs="Calibri" w:eastAsia="Calibri" w:hAnsi="Calibri"/>
-          <w:b w:val="1"/>
-          <w:bCs w:val="1"/>
-          <w:i w:val="0"/>
-          <w:iCs w:val="0"/>
+          <w:b/>
           <w:sz w:val="20"/>
-          <w:szCs w:val="20"/>
-          <w:rtl w:val="0"/>
         </w:rPr>
-        <w:t xml:space="preserve">DARPA TIAMAT</w:t>
+        <w:t>actor–critic RL</w:t>
       </w:r>
       <w:r>
         <w:rPr>
-          <w:rFonts w:ascii="Calibri" w:cs="Calibri" w:eastAsia="Calibri" w:hAnsi="Calibri"/>
-          <w:b w:val="0"/>
-          <w:bCs w:val="0"/>
-          <w:i w:val="0"/>
-          <w:iCs w:val="0"/>
           <w:sz w:val="20"/>
-          <w:szCs w:val="20"/>
-          <w:rtl w:val="0"/>
         </w:rPr>
-        <w:t xml:space="preserve">, a U.S. military initiative to rapidly deploy autonomous systems that adapt to changing environments.</w:t>
+        <w:t xml:space="preserve"> to refine gene combinations; on renal carcinoma data, a </w:t>
       </w:r>
       <w:r>
         <w:rPr>
-          <w:rtl w:val="0"/>
+          <w:b/>
+          <w:sz w:val="20"/>
         </w:rPr>
+        <w:t>500-gene panel</w:t>
+      </w:r>
+      <w:r>
+        <w:rPr>
+          <w:sz w:val="20"/>
+        </w:rPr>
+        <w:t xml:space="preserve"> outperformed conventional selectors in clustering agreement while preserving cell-type structure comparable to using 20,000+ genes.</w:t>
+      </w:r>
+      <w:r>
         <w:t xml:space="preserve"> </w:t>
       </w:r>
-      <w:hyperlink r:id="rId12">
+      <w:hyperlink r:id="rId15">
         <w:r>
           <w:rPr>
+            <w:u w:val="single"/>
             <w:color w:val="0563C1"/>
+            <w:sz w:val="20"/>
             <w:u w:val="single"/>
-            <w:rFonts w:ascii="Calibri" w:cs="Calibri" w:eastAsia="Calibri" w:hAnsi="Calibri"/>
-            <w:b w:val="0"/>
-            <w:bCs w:val="0"/>
-            <w:i w:val="0"/>
-            <w:iCs w:val="0"/>
-            <w:sz w:val="20"/>
-            <w:szCs w:val="20"/>
-            <w:rtl w:val="0"/>
           </w:rPr>
-          <w:t xml:space="preserve">(project page)</w:t>
+          <w:t>view work</w:t>
+        </w:r>
+      </w:hyperlink>
+    </w:p>
+    <w:p>
+      <w:pPr>
+        <w:spacing w:after="20" w:line="240" w:lineRule="auto"/>
+      </w:pPr>
+      <w:r>
+        <w:rPr>
+          <w:sz w:val="20"/>
+        </w:rPr>
+        <w:t>Led research in 4D embryo alignment for PantheonOS, coupling optimal transport with spatial registration to map cells across developmental stages; improved alignment consistency by 21% on embryonic heart data against a reference set of allowed cell-fate transitions.</w:t>
+      </w:r>
+      <w:r>
+        <w:t xml:space="preserve"> </w:t>
+      </w:r>
+      <w:hyperlink r:id="rId8">
+        <w:r>
+          <w:rPr>
+            <w:u w:val="single"/>
+          </w:rPr>
+          <w:t>view work</w:t>
         </w:r>
       </w:hyperlink>
     </w:p>
@@ -666,96 +604,41 @@
           <w:ilvl w:val="0"/>
           <w:numId w:val="1"/>
         </w:numPr>
-        <w:spacing w:after="4" w:before="0" w:line="235" w:lineRule="auto"/>
+        <w:spacing w:after="20" w:before="0" w:line="240" w:lineRule="auto"/>
         <w:ind w:left="122" w:hanging="122"/>
         <w:rPr/>
       </w:pPr>
       <w:r>
         <w:rPr>
-          <w:rFonts w:ascii="Calibri" w:cs="Calibri" w:eastAsia="Calibri" w:hAnsi="Calibri"/>
-          <w:b w:val="0"/>
-          <w:bCs w:val="0"/>
-          <w:i w:val="0"/>
-          <w:iCs w:val="0"/>
           <w:sz w:val="20"/>
-          <w:szCs w:val="20"/>
-          <w:rtl w:val="0"/>
         </w:rPr>
-        <w:t xml:space="preserve">Trained a </w:t>
+        <w:t xml:space="preserve">Developed a generative virtual embryo model that reconstructs tissue anatomy from a single computational seed cell using neural cellular automata and a neural decoder; contributing to the </w:t>
       </w:r>
       <w:r>
         <w:rPr>
-          <w:rFonts w:ascii="Calibri" w:cs="Calibri" w:eastAsia="Calibri" w:hAnsi="Calibri"/>
-          <w:b w:val="1"/>
-          <w:bCs w:val="1"/>
-          <w:i w:val="0"/>
-          <w:iCs w:val="0"/>
+          <w:b/>
           <w:sz w:val="20"/>
-          <w:szCs w:val="20"/>
-          <w:rtl w:val="0"/>
         </w:rPr>
-        <w:t xml:space="preserve">language-conditioned visual drone-navigation policy</w:t>
+        <w:t>Virtual Embryo Challenge</w:t>
       </w:r>
       <w:r>
         <w:rPr>
-          <w:rFonts w:ascii="Calibri" w:cs="Calibri" w:eastAsia="Calibri" w:hAnsi="Calibri"/>
-          <w:b w:val="0"/>
-          <w:bCs w:val="0"/>
-          <w:i w:val="0"/>
-          <w:iCs w:val="0"/>
           <w:sz w:val="20"/>
-          <w:szCs w:val="20"/>
-          <w:rtl w:val="0"/>
         </w:rPr>
-        <w:t xml:space="preserve"> using RRT expert demonstrations and iterative imitation learning (DAgger), grounding instructions in visual targets and raising navigation success </w:t>
+        <w:t>.</w:t>
       </w:r>
       <w:r>
-        <w:rPr>
-          <w:rFonts w:ascii="Calibri" w:cs="Calibri" w:eastAsia="Calibri" w:hAnsi="Calibri"/>
-          <w:b w:val="1"/>
-          <w:bCs w:val="1"/>
-          <w:i w:val="0"/>
-          <w:iCs w:val="0"/>
-          <w:sz w:val="20"/>
-          <w:szCs w:val="20"/>
-          <w:rtl w:val="0"/>
-        </w:rPr>
-        <w:t xml:space="preserve">from 52% to 90%</w:t>
-      </w:r>
-      <w:r>
-        <w:rPr>
-          <w:rFonts w:ascii="Calibri" w:cs="Calibri" w:eastAsia="Calibri" w:hAnsi="Calibri"/>
-          <w:b w:val="0"/>
-          <w:bCs w:val="0"/>
-          <w:i w:val="0"/>
-          <w:iCs w:val="0"/>
-          <w:sz w:val="20"/>
-          <w:szCs w:val="20"/>
-          <w:rtl w:val="0"/>
-        </w:rPr>
-        <w:t xml:space="preserve">.</w:t>
-      </w:r>
-      <w:r>
-        <w:rPr>
-          <w:rtl w:val="0"/>
-        </w:rPr>
         <w:t xml:space="preserve"> </w:t>
       </w:r>
-      <w:hyperlink r:id="rId7">
+      <w:hyperlink r:id="rId13">
         <w:r>
           <w:rPr>
+            <w:u w:val="single"/>
             <w:color w:val="0563C1"/>
+            <w:sz w:val="20"/>
             <w:u w:val="single"/>
-            <w:rFonts w:ascii="Calibri" w:cs="Calibri" w:eastAsia="Calibri" w:hAnsi="Calibri"/>
-            <w:b w:val="0"/>
-            <w:bCs w:val="0"/>
-            <w:i w:val="0"/>
-            <w:iCs w:val="0"/>
-            <w:sz w:val="20"/>
-            <w:szCs w:val="20"/>
-            <w:rtl w:val="0"/>
           </w:rPr>
-          <w:t xml:space="preserve">(project page)</w:t>
+          <w:t>Virtual Embryo Challenge</w:t>
         </w:r>
       </w:hyperlink>
     </w:p>
@@ -766,149 +649,34 @@
         <w:tabs>
           <w:tab w:val="right" w:leader="none" w:pos="11606"/>
         </w:tabs>
-        <w:spacing w:after="3" w:before="16" w:line="235" w:lineRule="auto"/>
+        <w:spacing w:after="20" w:before="16" w:line="240" w:lineRule="auto"/>
         <w:rPr/>
       </w:pPr>
       <w:r>
         <w:rPr>
-          <w:rFonts w:ascii="Calibri" w:cs="Calibri" w:eastAsia="Calibri" w:hAnsi="Calibri"/>
-          <w:b w:val="1"/>
-          <w:bCs w:val="1"/>
-          <w:i w:val="0"/>
-          <w:iCs w:val="0"/>
+          <w:b/>
           <w:sz w:val="20"/>
-          <w:szCs w:val="20"/>
-          <w:rtl w:val="0"/>
         </w:rPr>
-        <w:t xml:space="preserve">Stanford School of Medicine</w:t>
+        <w:t>Machine Learning &amp; Simulation Intern</w:t>
       </w:r>
       <w:r>
         <w:rPr>
-          <w:rFonts w:ascii="Calibri" w:cs="Calibri" w:eastAsia="Calibri" w:hAnsi="Calibri"/>
-          <w:b w:val="0"/>
-          <w:bCs w:val="0"/>
-          <w:i w:val="0"/>
-          <w:iCs w:val="0"/>
           <w:sz w:val="20"/>
-          <w:szCs w:val="20"/>
-          <w:rtl w:val="0"/>
-        </w:rPr>
-        <w:t xml:space="preserve"> | </w:t>
-      </w:r>
-      <w:r>
-        <w:rPr>
-          <w:rtl w:val="0"/>
-        </w:rPr>
-        <w:t xml:space="preserve">Multi-Agent AI &amp; Computational Biology Researcher </w:t>
-      </w:r>
-      <w:r>
-        <w:rPr>
-          <w:rFonts w:ascii="Calibri" w:cs="Calibri" w:eastAsia="Calibri" w:hAnsi="Calibri"/>
-          <w:b w:val="0"/>
-          <w:bCs w:val="0"/>
-          <w:i w:val="0"/>
-          <w:iCs w:val="0"/>
-          <w:sz w:val="20"/>
-          <w:szCs w:val="20"/>
-          <w:rtl w:val="0"/>
-        </w:rPr>
-        <w:t xml:space="preserve">, Qiu Lab</w:t>
-      </w:r>
-      <w:r>
-        <w:rPr>
-          <w:rFonts w:ascii="Calibri" w:cs="Calibri" w:eastAsia="Calibri" w:hAnsi="Calibri"/>
-          <w:b w:val="0"/>
-          <w:bCs w:val="0"/>
-          <w:i w:val="0"/>
-          <w:iCs w:val="0"/>
-          <w:color w:val="4d555c"/>
-          <w:sz w:val="20"/>
-          <w:szCs w:val="20"/>
-          <w:rtl w:val="0"/>
         </w:rPr>
         <w:tab/>
-        <w:t xml:space="preserve">Oct. 2025–Present</w:t>
-      </w:r>
-      <w:r>
-        <w:rPr>
-          <w:rtl w:val="0"/>
-        </w:rPr>
+        <w:t>Apr.–Aug. 2025</w:t>
       </w:r>
     </w:p>
     <w:p>
       <w:pPr>
-        <w:keepNext w:val="1"/>
-        <w:pageBreakBefore w:val="0"/>
-        <w:numPr>
-          <w:ilvl w:val="0"/>
-          <w:numId w:val="1"/>
-        </w:numPr>
-        <w:spacing w:after="4" w:before="0" w:line="235" w:lineRule="auto"/>
-        <w:ind w:left="122" w:hanging="122"/>
-        <w:rPr/>
+        <w:spacing w:after="20" w:line="240" w:lineRule="auto"/>
       </w:pPr>
       <w:r>
         <w:rPr>
-          <w:rFonts w:ascii="Calibri" w:cs="Calibri" w:eastAsia="Calibri" w:hAnsi="Calibri"/>
-          <w:b w:val="0"/>
-          <w:bCs w:val="0"/>
-          <w:i w:val="0"/>
-          <w:iCs w:val="0"/>
           <w:sz w:val="20"/>
-          <w:szCs w:val="20"/>
-          <w:rtl w:val="0"/>
         </w:rPr>
-        <w:t xml:space="preserve">Formulated gene-panel selection as a reinforcement-learning problem, balancing panel size against cell-type discrimination; developing 3D/4D tissue-alignment tools for </w:t>
+        <w:t>Stevens Institute of Technology | Computational Fluid Dynamics</w:t>
       </w:r>
-      <w:r>
-        <w:rPr>
-          <w:rFonts w:ascii="Calibri" w:cs="Calibri" w:eastAsia="Calibri" w:hAnsi="Calibri"/>
-          <w:b w:val="1"/>
-          <w:bCs w:val="1"/>
-          <w:i w:val="0"/>
-          <w:iCs w:val="0"/>
-          <w:sz w:val="20"/>
-          <w:szCs w:val="20"/>
-          <w:rtl w:val="0"/>
-        </w:rPr>
-        <w:t xml:space="preserve">PantheonOS</w:t>
-      </w:r>
-      <w:r>
-        <w:rPr>
-          <w:rFonts w:ascii="Calibri" w:cs="Calibri" w:eastAsia="Calibri" w:hAnsi="Calibri"/>
-          <w:b w:val="0"/>
-          <w:bCs w:val="0"/>
-          <w:i w:val="0"/>
-          <w:iCs w:val="0"/>
-          <w:sz w:val="20"/>
-          <w:szCs w:val="20"/>
-          <w:rtl w:val="0"/>
-        </w:rPr>
-        <w:t xml:space="preserve">, a multi-agent AI framework for autonomous scientific research.</w:t>
-      </w:r>
-      <w:r>
-        <w:rPr>
-          <w:rtl w:val="0"/>
-        </w:rPr>
-        <w:t xml:space="preserve"> </w:t>
-      </w:r>
-      <w:hyperlink r:id="rId8">
-        <w:r>
-          <w:rPr>
-            <w:color w:val="0563C1"/>
-            <w:u w:val="single"/>
-            <w:rFonts w:ascii="Calibri" w:cs="Calibri" w:eastAsia="Calibri" w:hAnsi="Calibri"/>
-            <w:b w:val="0"/>
-            <w:bCs w:val="0"/>
-            <w:i w:val="0"/>
-            <w:iCs w:val="0"/>
-            <w:sz w:val="20"/>
-            <w:szCs w:val="20"/>
-            <w:rtl w:val="0"/>
-          </w:rPr>
-          <w:t xml:space="preserve">(project page)</w:t>
-        </w:r>
-      </w:hyperlink>
     </w:p>
     <w:p>
       <w:pPr>
@@ -918,148 +686,41 @@
           <w:ilvl w:val="0"/>
           <w:numId w:val="1"/>
         </w:numPr>
-        <w:spacing w:after="4" w:before="0" w:line="235" w:lineRule="auto"/>
+        <w:spacing w:after="20" w:before="0" w:line="240" w:lineRule="auto"/>
         <w:ind w:left="122" w:hanging="122"/>
         <w:rPr/>
       </w:pPr>
       <w:r>
         <w:rPr>
-          <w:rFonts w:ascii="Calibri" w:cs="Calibri" w:eastAsia="Calibri" w:hAnsi="Calibri"/>
-          <w:b w:val="0"/>
-          <w:bCs w:val="0"/>
-          <w:i w:val="0"/>
-          <w:iCs w:val="0"/>
           <w:sz w:val="20"/>
-          <w:szCs w:val="20"/>
-          <w:rtl w:val="0"/>
         </w:rPr>
-        <w:t xml:space="preserve">Modeling 3D embryo development and co-developing the </w:t>
+        <w:t xml:space="preserve">Ran 80,000+ flow simulations and combined physics-informed surrogate modeling with optimization across simulation fidelities for Mars-landing parachute fabric; optimized pore geometries reproduced experimental permeability with </w:t>
       </w:r>
       <w:r>
         <w:rPr>
-          <w:rFonts w:ascii="Calibri" w:cs="Calibri" w:eastAsia="Calibri" w:hAnsi="Calibri"/>
-          <w:b w:val="1"/>
-          <w:bCs w:val="1"/>
-          <w:i w:val="0"/>
-          <w:iCs w:val="0"/>
+          <w:b/>
           <w:sz w:val="20"/>
-          <w:szCs w:val="20"/>
-          <w:rtl w:val="0"/>
         </w:rPr>
-        <w:t xml:space="preserve">Virtual Embryo Challenge’s</w:t>
+        <w:t>&lt;1% mean error</w:t>
       </w:r>
       <w:r>
         <w:rPr>
-          <w:rFonts w:ascii="Calibri" w:cs="Calibri" w:eastAsia="Calibri" w:hAnsi="Calibri"/>
-          <w:b w:val="0"/>
-          <w:bCs w:val="0"/>
-          <w:i w:val="0"/>
-          <w:iCs w:val="0"/>
           <w:sz w:val="20"/>
-          <w:szCs w:val="20"/>
-          <w:rtl w:val="0"/>
         </w:rPr>
-        <w:t xml:space="preserve"> agent interface for a shared benchmark; the broader project won </w:t>
+        <w:t>.</w:t>
       </w:r>
       <w:r>
-        <w:rPr>
-          <w:rFonts w:ascii="Calibri" w:cs="Calibri" w:eastAsia="Calibri" w:hAnsi="Calibri"/>
-          <w:b w:val="1"/>
-          <w:bCs w:val="1"/>
-          <w:i w:val="0"/>
-          <w:iCs w:val="0"/>
-          <w:sz w:val="20"/>
-          <w:szCs w:val="20"/>
-          <w:rtl w:val="0"/>
-        </w:rPr>
-        <w:t xml:space="preserve">one of eight seed grants</w:t>
-      </w:r>
-      <w:r>
-        <w:rPr>
-          <w:rFonts w:ascii="Calibri" w:cs="Calibri" w:eastAsia="Calibri" w:hAnsi="Calibri"/>
-          <w:b w:val="0"/>
-          <w:bCs w:val="0"/>
-          <w:i w:val="0"/>
-          <w:iCs w:val="0"/>
-          <w:sz w:val="20"/>
-          <w:szCs w:val="20"/>
-          <w:rtl w:val="0"/>
-        </w:rPr>
-        <w:t xml:space="preserve"> in </w:t>
-      </w:r>
-      <w:r>
-        <w:rPr>
-          <w:rFonts w:ascii="Calibri" w:cs="Calibri" w:eastAsia="Calibri" w:hAnsi="Calibri"/>
-          <w:b w:val="1"/>
-          <w:bCs w:val="1"/>
-          <w:i w:val="0"/>
-          <w:iCs w:val="0"/>
-          <w:sz w:val="20"/>
-          <w:szCs w:val="20"/>
-          <w:rtl w:val="0"/>
-        </w:rPr>
-        <w:t xml:space="preserve">Laude Institute’s Moonshots</w:t>
-      </w:r>
-      <w:r>
-        <w:rPr>
-          <w:rFonts w:ascii="Calibri" w:cs="Calibri" w:eastAsia="Calibri" w:hAnsi="Calibri"/>
-          <w:b w:val="0"/>
-          <w:bCs w:val="0"/>
-          <w:i w:val="0"/>
-          <w:iCs w:val="0"/>
-          <w:sz w:val="20"/>
-          <w:szCs w:val="20"/>
-          <w:rtl w:val="0"/>
-        </w:rPr>
-        <w:t xml:space="preserve"> and is competing for a </w:t>
-      </w:r>
-      <w:r>
-        <w:rPr>
-          <w:rFonts w:ascii="Calibri" w:cs="Calibri" w:eastAsia="Calibri" w:hAnsi="Calibri"/>
-          <w:b w:val="1"/>
-          <w:bCs w:val="1"/>
-          <w:i w:val="0"/>
-          <w:iCs w:val="0"/>
-          <w:sz w:val="20"/>
-          <w:szCs w:val="20"/>
-          <w:rtl w:val="0"/>
-        </w:rPr>
-        <w:t xml:space="preserve">$10M AI-research lab</w:t>
-      </w:r>
-      <w:r>
-        <w:rPr>
-          <w:rFonts w:ascii="Calibri" w:cs="Calibri" w:eastAsia="Calibri" w:hAnsi="Calibri"/>
-          <w:b w:val="0"/>
-          <w:bCs w:val="0"/>
-          <w:i w:val="0"/>
-          <w:iCs w:val="0"/>
-          <w:sz w:val="20"/>
-          <w:szCs w:val="20"/>
-          <w:rtl w:val="0"/>
-        </w:rPr>
-        <w:t xml:space="preserve">.</w:t>
-      </w:r>
-      <w:r>
-        <w:rPr>
-          <w:rtl w:val="0"/>
-        </w:rPr>
         <w:t xml:space="preserve"> </w:t>
       </w:r>
-      <w:hyperlink r:id="rId13">
+      <w:hyperlink r:id="rId9">
         <w:r>
           <w:rPr>
+            <w:u w:val="single"/>
             <w:color w:val="0563C1"/>
+            <w:sz w:val="20"/>
             <w:u w:val="single"/>
-            <w:rFonts w:ascii="Calibri" w:cs="Calibri" w:eastAsia="Calibri" w:hAnsi="Calibri"/>
-            <w:b w:val="0"/>
-            <w:bCs w:val="0"/>
-            <w:i w:val="0"/>
-            <w:iCs w:val="0"/>
-            <w:sz w:val="20"/>
-            <w:szCs w:val="20"/>
-            <w:rtl w:val="0"/>
           </w:rPr>
-          <w:t xml:space="preserve">(project page)</w:t>
+          <w:t>view work</w:t>
         </w:r>
       </w:hyperlink>
     </w:p>
@@ -1070,60 +731,33 @@
         <w:tabs>
           <w:tab w:val="right" w:leader="none" w:pos="11606"/>
         </w:tabs>
-        <w:spacing w:after="3" w:before="16" w:line="235" w:lineRule="auto"/>
+        <w:spacing w:after="20" w:before="16" w:line="240" w:lineRule="auto"/>
         <w:rPr/>
       </w:pPr>
       <w:r>
         <w:rPr>
-          <w:rFonts w:ascii="Calibri" w:cs="Calibri" w:eastAsia="Calibri" w:hAnsi="Calibri"/>
-          <w:b w:val="1"/>
-          <w:bCs w:val="1"/>
-          <w:i w:val="0"/>
-          <w:iCs w:val="0"/>
+          <w:b/>
           <w:sz w:val="20"/>
-          <w:szCs w:val="20"/>
-          <w:rtl w:val="0"/>
         </w:rPr>
-        <w:t xml:space="preserve">Stevens Institute of Technology</w:t>
+        <w:t>Multiphysics Simulation Intern</w:t>
       </w:r>
       <w:r>
         <w:rPr>
-          <w:rFonts w:ascii="Calibri" w:cs="Calibri" w:eastAsia="Calibri" w:hAnsi="Calibri"/>
-          <w:b w:val="0"/>
-          <w:bCs w:val="0"/>
-          <w:i w:val="0"/>
-          <w:iCs w:val="0"/>
           <w:sz w:val="20"/>
-          <w:szCs w:val="20"/>
-          <w:rtl w:val="0"/>
         </w:rPr>
-        <w:t xml:space="preserve"> | </w:t>
+        <w:tab/>
+        <w:t>Jun.–Sep. 2024</w:t>
       </w:r>
+    </w:p>
+    <w:p>
+      <w:pPr>
+        <w:spacing w:after="20" w:line="240" w:lineRule="auto"/>
+      </w:pPr>
       <w:r>
         <w:rPr>
-          <w:rtl w:val="0"/>
+          <w:sz w:val="20"/>
         </w:rPr>
-        <w:t xml:space="preserve">Computational Fluid Dynamics &amp; ML Intern</w:t>
-      </w:r>
-      <w:r>
-        <w:rPr>
-          <w:rFonts w:ascii="Calibri" w:cs="Calibri" w:eastAsia="Calibri" w:hAnsi="Calibri"/>
-          <w:b w:val="0"/>
-          <w:bCs w:val="0"/>
-          <w:i w:val="0"/>
-          <w:iCs w:val="0"/>
-          <w:color w:val="4d555c"/>
-          <w:sz w:val="20"/>
-          <w:szCs w:val="20"/>
-          <w:rtl w:val="0"/>
-        </w:rPr>
-        <w:tab/>
-        <w:t xml:space="preserve">Apr.–Aug. 2025</w:t>
-      </w:r>
-      <w:r>
-        <w:rPr>
-          <w:rtl w:val="0"/>
-        </w:rPr>
+        <w:t>Daher Aerospace</w:t>
       </w:r>
     </w:p>
     <w:p>
@@ -1134,171 +768,7 @@
           <w:ilvl w:val="0"/>
           <w:numId w:val="1"/>
         </w:numPr>
-        <w:spacing w:after="4" w:before="0" w:line="235" w:lineRule="auto"/>
-        <w:ind w:left="122" w:hanging="122"/>
-        <w:rPr/>
-      </w:pPr>
-      <w:r>
-        <w:rPr>
-          <w:rFonts w:ascii="Calibri" w:cs="Calibri" w:eastAsia="Calibri" w:hAnsi="Calibri"/>
-          <w:b w:val="0"/>
-          <w:bCs w:val="0"/>
-          <w:i w:val="0"/>
-          <w:iCs w:val="0"/>
-          <w:sz w:val="20"/>
-          <w:szCs w:val="20"/>
-          <w:rtl w:val="0"/>
-        </w:rPr>
-        <w:t xml:space="preserve">Built physics-informed, multi-fidelity surrogate models of Mars-landing parachute broadcloth, matching experimental permeability with </w:t>
-      </w:r>
-      <w:r>
-        <w:rPr>
-          <w:rFonts w:ascii="Calibri" w:cs="Calibri" w:eastAsia="Calibri" w:hAnsi="Calibri"/>
-          <w:b w:val="1"/>
-          <w:bCs w:val="1"/>
-          <w:i w:val="0"/>
-          <w:iCs w:val="0"/>
-          <w:sz w:val="20"/>
-          <w:szCs w:val="20"/>
-          <w:rtl w:val="0"/>
-        </w:rPr>
-        <w:t xml:space="preserve">&lt;1% mean error</w:t>
-      </w:r>
-      <w:r>
-        <w:rPr>
-          <w:rFonts w:ascii="Calibri" w:cs="Calibri" w:eastAsia="Calibri" w:hAnsi="Calibri"/>
-          <w:b w:val="0"/>
-          <w:bCs w:val="0"/>
-          <w:i w:val="0"/>
-          <w:iCs w:val="0"/>
-          <w:sz w:val="20"/>
-          <w:szCs w:val="20"/>
-          <w:rtl w:val="0"/>
-        </w:rPr>
-        <w:t xml:space="preserve">; this fabric type was also used in </w:t>
-      </w:r>
-      <w:r>
-        <w:rPr>
-          <w:rFonts w:ascii="Calibri" w:cs="Calibri" w:eastAsia="Calibri" w:hAnsi="Calibri"/>
-          <w:b w:val="1"/>
-          <w:bCs w:val="1"/>
-          <w:i w:val="0"/>
-          <w:iCs w:val="0"/>
-          <w:sz w:val="20"/>
-          <w:szCs w:val="20"/>
-          <w:rtl w:val="0"/>
-        </w:rPr>
-        <w:t xml:space="preserve">Orion’s Artemis II 2026 recovery parachutes</w:t>
-      </w:r>
-      <w:r>
-        <w:rPr>
-          <w:rFonts w:ascii="Calibri" w:cs="Calibri" w:eastAsia="Calibri" w:hAnsi="Calibri"/>
-          <w:b w:val="0"/>
-          <w:bCs w:val="0"/>
-          <w:i w:val="0"/>
-          <w:iCs w:val="0"/>
-          <w:sz w:val="20"/>
-          <w:szCs w:val="20"/>
-          <w:rtl w:val="0"/>
-        </w:rPr>
-        <w:t xml:space="preserve">.</w:t>
-      </w:r>
-      <w:r>
-        <w:rPr>
-          <w:rtl w:val="0"/>
-        </w:rPr>
-        <w:t xml:space="preserve"> </w:t>
-      </w:r>
-      <w:hyperlink r:id="rId9">
-        <w:r>
-          <w:rPr>
-            <w:color w:val="0563C1"/>
-            <w:u w:val="single"/>
-            <w:rFonts w:ascii="Calibri" w:cs="Calibri" w:eastAsia="Calibri" w:hAnsi="Calibri"/>
-            <w:b w:val="0"/>
-            <w:bCs w:val="0"/>
-            <w:i w:val="0"/>
-            <w:iCs w:val="0"/>
-            <w:sz w:val="20"/>
-            <w:szCs w:val="20"/>
-            <w:rtl w:val="0"/>
-          </w:rPr>
-          <w:t xml:space="preserve">(project page)</w:t>
-        </w:r>
-      </w:hyperlink>
-    </w:p>
-    <w:p>
-      <w:pPr>
-        <w:keepNext w:val="1"/>
-        <w:pageBreakBefore w:val="0"/>
-        <w:tabs>
-          <w:tab w:val="right" w:leader="none" w:pos="11606"/>
-        </w:tabs>
-        <w:spacing w:after="3" w:before="16" w:line="235" w:lineRule="auto"/>
-        <w:rPr/>
-      </w:pPr>
-      <w:r>
-        <w:rPr>
-          <w:rFonts w:ascii="Calibri" w:cs="Calibri" w:eastAsia="Calibri" w:hAnsi="Calibri"/>
-          <w:b w:val="1"/>
-          <w:bCs w:val="1"/>
-          <w:i w:val="0"/>
-          <w:iCs w:val="0"/>
-          <w:sz w:val="20"/>
-          <w:szCs w:val="20"/>
-          <w:rtl w:val="0"/>
-        </w:rPr>
-        <w:t xml:space="preserve">Daher Aerospace</w:t>
-      </w:r>
-      <w:r>
-        <w:rPr>
-          <w:rFonts w:ascii="Calibri" w:cs="Calibri" w:eastAsia="Calibri" w:hAnsi="Calibri"/>
-          <w:b w:val="0"/>
-          <w:bCs w:val="0"/>
-          <w:i w:val="0"/>
-          <w:iCs w:val="0"/>
-          <w:sz w:val="20"/>
-          <w:szCs w:val="20"/>
-          <w:rtl w:val="0"/>
-        </w:rPr>
-        <w:t xml:space="preserve"> |</w:t>
-      </w:r>
-      <w:r>
-        <w:rPr>
-          <w:rtl w:val="0"/>
-        </w:rPr>
-        <w:t xml:space="preserve">Multiphysics Simulation Intern</w:t>
-      </w:r>
-      <w:r>
-        <w:rPr>
-          <w:rFonts w:ascii="Calibri" w:cs="Calibri" w:eastAsia="Calibri" w:hAnsi="Calibri"/>
-          <w:b w:val="0"/>
-          <w:bCs w:val="0"/>
-          <w:i w:val="0"/>
-          <w:iCs w:val="0"/>
-          <w:color w:val="4d555c"/>
-          <w:sz w:val="20"/>
-          <w:szCs w:val="20"/>
-          <w:rtl w:val="0"/>
-        </w:rPr>
-        <w:tab/>
-        <w:t xml:space="preserve">Jun.–Sep. 2024</w:t>
-      </w:r>
-      <w:r>
-        <w:rPr>
-          <w:rtl w:val="0"/>
-        </w:rPr>
-      </w:r>
-    </w:p>
-    <w:p>
-      <w:pPr>
-        <w:keepNext w:val="0"/>
-        <w:pageBreakBefore w:val="0"/>
-        <w:numPr>
-          <w:ilvl w:val="0"/>
-          <w:numId w:val="1"/>
-        </w:numPr>
-        <w:spacing w:after="4" w:before="0" w:line="235" w:lineRule="auto"/>
+        <w:spacing w:after="20" w:before="0" w:line="240" w:lineRule="auto"/>
         <w:ind w:left="122" w:hanging="122"/>
         <w:rPr/>
       </w:pPr>
@@ -1328,54 +798,33 @@
         <w:tabs>
           <w:tab w:val="right" w:leader="none" w:pos="11606"/>
         </w:tabs>
-        <w:spacing w:after="3" w:before="16" w:line="235" w:lineRule="auto"/>
+        <w:spacing w:after="20" w:before="16" w:line="240" w:lineRule="auto"/>
         <w:rPr/>
       </w:pPr>
       <w:r>
         <w:rPr>
-          <w:rFonts w:ascii="Calibri" w:cs="Calibri" w:eastAsia="Calibri" w:hAnsi="Calibri"/>
-          <w:b w:val="1"/>
-          <w:bCs w:val="1"/>
-          <w:i w:val="0"/>
-          <w:iCs w:val="0"/>
+          <w:b/>
           <w:sz w:val="20"/>
-          <w:szCs w:val="20"/>
-          <w:rtl w:val="0"/>
         </w:rPr>
-        <w:t xml:space="preserve">École Polytechnique / The Exploration Company</w:t>
+        <w:t>Autonomous Docking — Research Project</w:t>
       </w:r>
       <w:r>
         <w:rPr>
-          <w:rFonts w:ascii="Calibri" w:cs="Calibri" w:eastAsia="Calibri" w:hAnsi="Calibri"/>
-          <w:b w:val="0"/>
-          <w:bCs w:val="0"/>
-          <w:i w:val="0"/>
-          <w:iCs w:val="0"/>
           <w:sz w:val="20"/>
-          <w:szCs w:val="20"/>
-          <w:rtl w:val="0"/>
         </w:rPr>
-        <w:t xml:space="preserve"> | Research Project</w:t>
+        <w:tab/>
+        <w:t>Sep. 2023–May 2024</w:t>
       </w:r>
+    </w:p>
+    <w:p>
+      <w:pPr>
+        <w:spacing w:after="20" w:line="240" w:lineRule="auto"/>
+      </w:pPr>
       <w:r>
         <w:rPr>
-          <w:rFonts w:ascii="Calibri" w:cs="Calibri" w:eastAsia="Calibri" w:hAnsi="Calibri"/>
-          <w:b w:val="0"/>
-          <w:bCs w:val="0"/>
-          <w:i w:val="0"/>
-          <w:iCs w:val="0"/>
-          <w:color w:val="4d555c"/>
           <w:sz w:val="20"/>
-          <w:szCs w:val="20"/>
-          <w:rtl w:val="0"/>
         </w:rPr>
-        <w:tab/>
-        <w:t xml:space="preserve">Sep. 2023–May 2024</w:t>
-      </w:r>
-      <w:r>
-        <w:rPr>
-          <w:rtl w:val="0"/>
-        </w:rPr>
+        <w:t>École Polytechnique / The Exploration Company</w:t>
       </w:r>
     </w:p>
     <w:p>
@@ -1386,141 +835,41 @@
           <w:ilvl w:val="0"/>
           <w:numId w:val="1"/>
         </w:numPr>
-        <w:spacing w:after="4" w:before="0" w:line="235" w:lineRule="auto"/>
+        <w:spacing w:after="20" w:before="0" w:line="240" w:lineRule="auto"/>
         <w:ind w:left="122" w:hanging="122"/>
         <w:rPr/>
       </w:pPr>
       <w:r>
         <w:rPr>
-          <w:rFonts w:ascii="Calibri" w:cs="Calibri" w:eastAsia="Calibri" w:hAnsi="Calibri"/>
-          <w:b w:val="0"/>
-          <w:bCs w:val="0"/>
-          <w:i w:val="0"/>
-          <w:iCs w:val="0"/>
           <w:sz w:val="20"/>
-          <w:szCs w:val="20"/>
-          <w:rtl w:val="0"/>
         </w:rPr>
-        <w:t xml:space="preserve">Developed vision-based navigation and </w:t>
+        <w:t xml:space="preserve">Developed vision-based relative navigation and guidance for </w:t>
       </w:r>
       <w:r>
         <w:rPr>
-          <w:rtl w:val="0"/>
+          <w:b/>
+          <w:sz w:val="20"/>
         </w:rPr>
-        <w:t xml:space="preserve">guidance</w:t>
+        <w:t>Nyx’s autonomous docking</w:t>
       </w:r>
       <w:r>
         <w:rPr>
-          <w:rFonts w:ascii="Calibri" w:cs="Calibri" w:eastAsia="Calibri" w:hAnsi="Calibri"/>
-          <w:b w:val="0"/>
-          <w:bCs w:val="0"/>
-          <w:i w:val="0"/>
-          <w:iCs w:val="0"/>
           <w:sz w:val="20"/>
-          <w:szCs w:val="20"/>
-          <w:rtl w:val="0"/>
         </w:rPr>
-        <w:t xml:space="preserve"> for </w:t>
+        <w:t>; tested closed-loop maneuvers using a quadcopter as the hardware platform.</w:t>
       </w:r>
       <w:r>
-        <w:rPr>
-          <w:rFonts w:ascii="Calibri" w:cs="Calibri" w:eastAsia="Calibri" w:hAnsi="Calibri"/>
-          <w:b w:val="1"/>
-          <w:bCs w:val="1"/>
-          <w:i w:val="0"/>
-          <w:iCs w:val="0"/>
-          <w:sz w:val="20"/>
-          <w:szCs w:val="20"/>
-          <w:rtl w:val="0"/>
-        </w:rPr>
-        <w:t xml:space="preserve">Nyx</w:t>
-      </w:r>
-      <w:r>
-        <w:rPr>
-          <w:rFonts w:ascii="Calibri" w:cs="Calibri" w:eastAsia="Calibri" w:hAnsi="Calibri"/>
-          <w:b w:val="0"/>
-          <w:bCs w:val="0"/>
-          <w:i w:val="0"/>
-          <w:iCs w:val="0"/>
-          <w:sz w:val="20"/>
-          <w:szCs w:val="20"/>
-          <w:rtl w:val="0"/>
-        </w:rPr>
-        <w:t xml:space="preserve">’s autonomous docking; the spacecraft was selected by </w:t>
-      </w:r>
-      <w:r>
-        <w:rPr>
-          <w:rFonts w:ascii="Calibri" w:cs="Calibri" w:eastAsia="Calibri" w:hAnsi="Calibri"/>
-          <w:b w:val="1"/>
-          <w:bCs w:val="1"/>
-          <w:i w:val="0"/>
-          <w:iCs w:val="0"/>
-          <w:sz w:val="20"/>
-          <w:szCs w:val="20"/>
-          <w:rtl w:val="0"/>
-        </w:rPr>
-        <w:t xml:space="preserve">ESA</w:t>
-      </w:r>
-      <w:r>
-        <w:rPr>
-          <w:rFonts w:ascii="Calibri" w:cs="Calibri" w:eastAsia="Calibri" w:hAnsi="Calibri"/>
-          <w:b w:val="0"/>
-          <w:bCs w:val="0"/>
-          <w:i w:val="0"/>
-          <w:iCs w:val="0"/>
-          <w:sz w:val="20"/>
-          <w:szCs w:val="20"/>
-          <w:rtl w:val="0"/>
-        </w:rPr>
-        <w:t xml:space="preserve"> for ISS cargo missions and pre-booked by </w:t>
-      </w:r>
-      <w:r>
-        <w:rPr>
-          <w:rFonts w:ascii="Calibri" w:cs="Calibri" w:eastAsia="Calibri" w:hAnsi="Calibri"/>
-          <w:b w:val="1"/>
-          <w:bCs w:val="1"/>
-          <w:i w:val="0"/>
-          <w:iCs w:val="0"/>
-          <w:sz w:val="20"/>
-          <w:szCs w:val="20"/>
-          <w:rtl w:val="0"/>
-        </w:rPr>
-        <w:t xml:space="preserve">Axiom Space</w:t>
-      </w:r>
-      <w:r>
-        <w:rPr>
-          <w:rFonts w:ascii="Calibri" w:cs="Calibri" w:eastAsia="Calibri" w:hAnsi="Calibri"/>
-          <w:b w:val="0"/>
-          <w:bCs w:val="0"/>
-          <w:i w:val="0"/>
-          <w:iCs w:val="0"/>
-          <w:sz w:val="20"/>
-          <w:szCs w:val="20"/>
-          <w:rtl w:val="0"/>
-        </w:rPr>
-        <w:t xml:space="preserve"> for station resupply.</w:t>
-      </w:r>
-      <w:r>
-        <w:rPr>
-          <w:rtl w:val="0"/>
-        </w:rPr>
         <w:t xml:space="preserve"> </w:t>
       </w:r>
       <w:hyperlink r:id="rId10">
         <w:r>
           <w:rPr>
+            <w:u w:val="single"/>
             <w:color w:val="0563C1"/>
+            <w:sz w:val="20"/>
             <w:u w:val="single"/>
-            <w:rFonts w:ascii="Calibri" w:cs="Calibri" w:eastAsia="Calibri" w:hAnsi="Calibri"/>
-            <w:b w:val="0"/>
-            <w:bCs w:val="0"/>
-            <w:i w:val="0"/>
-            <w:iCs w:val="0"/>
-            <w:sz w:val="20"/>
-            <w:szCs w:val="20"/>
-            <w:rtl w:val="0"/>
           </w:rPr>
-          <w:t xml:space="preserve">(project page)</w:t>
+          <w:t>view work</w:t>
         </w:r>
       </w:hyperlink>
     </w:p>
@@ -1531,54 +880,33 @@
         <w:tabs>
           <w:tab w:val="right" w:leader="none" w:pos="11606"/>
         </w:tabs>
-        <w:spacing w:after="3" w:before="16" w:line="235" w:lineRule="auto"/>
+        <w:spacing w:after="20" w:before="16" w:line="240" w:lineRule="auto"/>
         <w:rPr/>
       </w:pPr>
       <w:r>
         <w:rPr>
-          <w:rFonts w:ascii="Calibri" w:cs="Calibri" w:eastAsia="Calibri" w:hAnsi="Calibri"/>
-          <w:b w:val="1"/>
-          <w:bCs w:val="1"/>
-          <w:i w:val="0"/>
-          <w:iCs w:val="0"/>
+          <w:b/>
           <w:sz w:val="20"/>
-          <w:szCs w:val="20"/>
-          <w:rtl w:val="0"/>
         </w:rPr>
-        <w:t xml:space="preserve">French Police Cybercrime Unit</w:t>
+        <w:t>Officer Cadet — AI Tool Development</w:t>
       </w:r>
       <w:r>
         <w:rPr>
-          <w:rFonts w:ascii="Calibri" w:cs="Calibri" w:eastAsia="Calibri" w:hAnsi="Calibri"/>
-          <w:b w:val="0"/>
-          <w:bCs w:val="0"/>
-          <w:i w:val="0"/>
-          <w:iCs w:val="0"/>
           <w:sz w:val="20"/>
-          <w:szCs w:val="20"/>
-          <w:rtl w:val="0"/>
         </w:rPr>
-        <w:t xml:space="preserve"> | Officer Cadet</w:t>
+        <w:tab/>
+        <w:t>Nov. 2022–Apr. 2023</w:t>
       </w:r>
+    </w:p>
+    <w:p>
+      <w:pPr>
+        <w:spacing w:after="20" w:line="240" w:lineRule="auto"/>
+      </w:pPr>
       <w:r>
         <w:rPr>
-          <w:rFonts w:ascii="Calibri" w:cs="Calibri" w:eastAsia="Calibri" w:hAnsi="Calibri"/>
-          <w:b w:val="0"/>
-          <w:bCs w:val="0"/>
-          <w:i w:val="0"/>
-          <w:iCs w:val="0"/>
-          <w:color w:val="4d555c"/>
           <w:sz w:val="20"/>
-          <w:szCs w:val="20"/>
-          <w:rtl w:val="0"/>
         </w:rPr>
-        <w:tab/>
-        <w:t xml:space="preserve">Nov. 2022–Apr. 2023</w:t>
-      </w:r>
-      <w:r>
-        <w:rPr>
-          <w:rtl w:val="0"/>
-        </w:rPr>
+        <w:t>French Police Cybercrime Unit</w:t>
       </w:r>
     </w:p>
     <w:p>
@@ -1589,485 +917,15 @@
           <w:ilvl w:val="0"/>
           <w:numId w:val="1"/>
         </w:numPr>
-        <w:spacing w:after="4" w:before="0" w:line="235" w:lineRule="auto"/>
+        <w:spacing w:after="20" w:before="0" w:line="240" w:lineRule="auto"/>
         <w:ind w:left="122" w:hanging="122"/>
         <w:rPr/>
       </w:pPr>
       <w:r>
         <w:rPr>
-          <w:rFonts w:ascii="Calibri" w:cs="Calibri" w:eastAsia="Calibri" w:hAnsi="Calibri"/>
-          <w:b w:val="1"/>
-          <w:bCs w:val="1"/>
-          <w:i w:val="0"/>
-          <w:iCs w:val="0"/>
           <w:sz w:val="20"/>
-          <w:szCs w:val="20"/>
-          <w:rtl w:val="0"/>
         </w:rPr>
-        <w:t xml:space="preserve">Led a team of trainee software engineers</w:t>
-      </w:r>
-      <w:r>
-        <w:rPr>
-          <w:rFonts w:ascii="Calibri" w:cs="Calibri" w:eastAsia="Calibri" w:hAnsi="Calibri"/>
-          <w:b w:val="0"/>
-          <w:bCs w:val="0"/>
-          <w:i w:val="0"/>
-          <w:iCs w:val="0"/>
-          <w:sz w:val="20"/>
-          <w:szCs w:val="20"/>
-          <w:rtl w:val="0"/>
-        </w:rPr>
-        <w:t xml:space="preserve">, working with police officers to develop an AI tool analyzing leaked communications, including the </w:t>
-      </w:r>
-      <w:r>
-        <w:rPr>
-          <w:rFonts w:ascii="Calibri" w:cs="Calibri" w:eastAsia="Calibri" w:hAnsi="Calibri"/>
-          <w:b w:val="1"/>
-          <w:bCs w:val="1"/>
-          <w:i w:val="0"/>
-          <w:iCs w:val="0"/>
-          <w:sz w:val="20"/>
-          <w:szCs w:val="20"/>
-          <w:rtl w:val="0"/>
-        </w:rPr>
-        <w:t xml:space="preserve">Conti leaks</w:t>
-      </w:r>
-      <w:r>
-        <w:rPr>
-          <w:rFonts w:ascii="Calibri" w:cs="Calibri" w:eastAsia="Calibri" w:hAnsi="Calibri"/>
-          <w:b w:val="0"/>
-          <w:bCs w:val="0"/>
-          <w:i w:val="0"/>
-          <w:iCs w:val="0"/>
-          <w:sz w:val="20"/>
-          <w:szCs w:val="20"/>
-          <w:rtl w:val="0"/>
-        </w:rPr>
-        <w:t xml:space="preserve">; authored guides to share investigative methods with new unit members.</w:t>
-      </w:r>
-      <w:r>
-        <w:rPr>
-          <w:rtl w:val="0"/>
-        </w:rPr>
-      </w:r>
-    </w:p>
-    <w:p>
-      <w:pPr>
-        <w:pStyle w:val="Heading1"/>
-        <w:keepNext w:val="1"/>
-        <w:pageBreakBefore w:val="0"/>
-        <w:pBdr>
-          <w:bottom w:color="adbcc4" w:space="2" w:sz="4" w:val="single"/>
-        </w:pBdr>
-        <w:spacing w:after="20" w:before="49" w:line="240" w:lineRule="auto"/>
-        <w:rPr/>
-      </w:pPr>
-      <w:r>
-        <w:rPr>
-          <w:rFonts w:ascii="Calibri" w:cs="Calibri" w:eastAsia="Calibri" w:hAnsi="Calibri"/>
-          <w:sz w:val="21"/>
-          <w:szCs w:val="21"/>
-          <w:rtl w:val="0"/>
-        </w:rPr>
-        <w:t xml:space="preserve">COMMUNITY ENGAGEMENT</w:t>
-      </w:r>
-      <w:r>
-        <w:rPr>
-          <w:rtl w:val="0"/>
-        </w:rPr>
-      </w:r>
-    </w:p>
-    <w:p>
-      <w:pPr>
-        <w:keepNext w:val="1"/>
-        <w:pageBreakBefore w:val="0"/>
-        <w:tabs>
-          <w:tab w:val="right" w:leader="none" w:pos="11606"/>
-        </w:tabs>
-        <w:spacing w:after="3" w:before="16" w:line="235" w:lineRule="auto"/>
-        <w:rPr/>
-      </w:pPr>
-      <w:r>
-        <w:rPr>
-          <w:rFonts w:ascii="Calibri" w:cs="Calibri" w:eastAsia="Calibri" w:hAnsi="Calibri"/>
-          <w:b w:val="1"/>
-          <w:bCs w:val="1"/>
-          <w:i w:val="0"/>
-          <w:iCs w:val="0"/>
-          <w:sz w:val="20"/>
-          <w:szCs w:val="20"/>
-          <w:rtl w:val="0"/>
-        </w:rPr>
-        <w:t xml:space="preserve">Stanford Black Graduate Student Association</w:t>
-      </w:r>
-      <w:r>
-        <w:rPr>
-          <w:rFonts w:ascii="Calibri" w:cs="Calibri" w:eastAsia="Calibri" w:hAnsi="Calibri"/>
-          <w:b w:val="0"/>
-          <w:bCs w:val="0"/>
-          <w:i w:val="0"/>
-          <w:iCs w:val="0"/>
-          <w:sz w:val="20"/>
-          <w:szCs w:val="20"/>
-          <w:rtl w:val="0"/>
-        </w:rPr>
-        <w:t xml:space="preserve"> | Fundraising Chair</w:t>
-      </w:r>
-      <w:r>
-        <w:rPr>
-          <w:rFonts w:ascii="Calibri" w:cs="Calibri" w:eastAsia="Calibri" w:hAnsi="Calibri"/>
-          <w:b w:val="0"/>
-          <w:bCs w:val="0"/>
-          <w:i w:val="0"/>
-          <w:iCs w:val="0"/>
-          <w:color w:val="4d555c"/>
-          <w:sz w:val="20"/>
-          <w:szCs w:val="20"/>
-          <w:rtl w:val="0"/>
-        </w:rPr>
-        <w:tab/>
-        <w:t xml:space="preserve">Sep. 2025–Present</w:t>
-      </w:r>
-      <w:r>
-        <w:rPr>
-          <w:rtl w:val="0"/>
-        </w:rPr>
-      </w:r>
-    </w:p>
-    <w:p>
-      <w:pPr>
-        <w:keepNext w:val="0"/>
-        <w:pageBreakBefore w:val="0"/>
-        <w:numPr>
-          <w:ilvl w:val="0"/>
-          <w:numId w:val="1"/>
-        </w:numPr>
-        <w:spacing w:after="4" w:before="0" w:line="235" w:lineRule="auto"/>
-        <w:ind w:left="122" w:hanging="122"/>
-        <w:rPr/>
-      </w:pPr>
-      <w:r>
-        <w:rPr>
-          <w:rFonts w:ascii="Calibri" w:cs="Calibri" w:eastAsia="Calibri" w:hAnsi="Calibri"/>
-          <w:b w:val="0"/>
-          <w:bCs w:val="0"/>
-          <w:i w:val="0"/>
-          <w:iCs w:val="0"/>
-          <w:sz w:val="20"/>
-          <w:szCs w:val="20"/>
-          <w:rtl w:val="0"/>
-        </w:rPr>
-        <w:t xml:space="preserve">Organized community events and raised </w:t>
-      </w:r>
-      <w:r>
-        <w:rPr>
-          <w:rFonts w:ascii="Calibri" w:cs="Calibri" w:eastAsia="Calibri" w:hAnsi="Calibri"/>
-          <w:b w:val="1"/>
-          <w:bCs w:val="1"/>
-          <w:i w:val="0"/>
-          <w:iCs w:val="0"/>
-          <w:sz w:val="20"/>
-          <w:szCs w:val="20"/>
-          <w:rtl w:val="0"/>
-        </w:rPr>
-        <w:t xml:space="preserve">$3,000+</w:t>
-      </w:r>
-      <w:r>
-        <w:rPr>
-          <w:rFonts w:ascii="Calibri" w:cs="Calibri" w:eastAsia="Calibri" w:hAnsi="Calibri"/>
-          <w:b w:val="0"/>
-          <w:bCs w:val="0"/>
-          <w:i w:val="0"/>
-          <w:iCs w:val="0"/>
-          <w:sz w:val="20"/>
-          <w:szCs w:val="20"/>
-          <w:rtl w:val="0"/>
-        </w:rPr>
-        <w:t xml:space="preserve"> toward a </w:t>
-      </w:r>
-      <w:r>
-        <w:rPr>
-          <w:rFonts w:ascii="Calibri" w:cs="Calibri" w:eastAsia="Calibri" w:hAnsi="Calibri"/>
-          <w:b w:val="1"/>
-          <w:bCs w:val="1"/>
-          <w:i w:val="0"/>
-          <w:iCs w:val="0"/>
-          <w:sz w:val="20"/>
-          <w:szCs w:val="20"/>
-          <w:rtl w:val="0"/>
-        </w:rPr>
-        <w:t xml:space="preserve">$10,000+ team fundraising effort</w:t>
-      </w:r>
-      <w:r>
-        <w:rPr>
-          <w:rFonts w:ascii="Calibri" w:cs="Calibri" w:eastAsia="Calibri" w:hAnsi="Calibri"/>
-          <w:b w:val="0"/>
-          <w:bCs w:val="0"/>
-          <w:i w:val="0"/>
-          <w:iCs w:val="0"/>
-          <w:sz w:val="20"/>
-          <w:szCs w:val="20"/>
-          <w:rtl w:val="0"/>
-        </w:rPr>
-        <w:t xml:space="preserve"> supporting Black graduate students</w:t>
-      </w:r>
-      <w:r>
-        <w:rPr>
-          <w:rtl w:val="0"/>
-        </w:rPr>
-        <w:t xml:space="preserve">.</w:t>
-      </w:r>
-      <w:r>
-        <w:rPr>
-          <w:rFonts w:ascii="Calibri" w:cs="Calibri" w:eastAsia="Calibri" w:hAnsi="Calibri"/>
-          <w:b w:val="0"/>
-          <w:bCs w:val="0"/>
-          <w:i w:val="0"/>
-          <w:iCs w:val="0"/>
-          <w:sz w:val="20"/>
-          <w:szCs w:val="20"/>
-          <w:rtl w:val="0"/>
-        </w:rPr>
-        <w:t xml:space="preserve">.</w:t>
-      </w:r>
-      <w:r>
-        <w:rPr>
-          <w:rtl w:val="0"/>
-        </w:rPr>
-      </w:r>
-    </w:p>
-    <w:p>
-      <w:pPr>
-        <w:keepNext w:val="1"/>
-        <w:pageBreakBefore w:val="0"/>
-        <w:tabs>
-          <w:tab w:val="right" w:leader="none" w:pos="11606"/>
-        </w:tabs>
-        <w:spacing w:after="3" w:before="16" w:line="235" w:lineRule="auto"/>
-        <w:rPr/>
-      </w:pPr>
-      <w:r>
-        <w:rPr>
-          <w:rFonts w:ascii="Calibri" w:cs="Calibri" w:eastAsia="Calibri" w:hAnsi="Calibri"/>
-          <w:b w:val="1"/>
-          <w:bCs w:val="1"/>
-          <w:i w:val="0"/>
-          <w:iCs w:val="0"/>
-          <w:sz w:val="20"/>
-          <w:szCs w:val="20"/>
-          <w:rtl w:val="0"/>
-        </w:rPr>
-        <w:t xml:space="preserve">Inspirit AI</w:t>
-      </w:r>
-      <w:r>
-        <w:rPr>
-          <w:rFonts w:ascii="Calibri" w:cs="Calibri" w:eastAsia="Calibri" w:hAnsi="Calibri"/>
-          <w:b w:val="0"/>
-          <w:bCs w:val="0"/>
-          <w:i w:val="0"/>
-          <w:iCs w:val="0"/>
-          <w:sz w:val="20"/>
-          <w:szCs w:val="20"/>
-          <w:rtl w:val="0"/>
-        </w:rPr>
-        <w:t xml:space="preserve"> | AI Instructor</w:t>
-      </w:r>
-      <w:r>
-        <w:rPr>
-          <w:rFonts w:ascii="Calibri" w:cs="Calibri" w:eastAsia="Calibri" w:hAnsi="Calibri"/>
-          <w:b w:val="0"/>
-          <w:bCs w:val="0"/>
-          <w:i w:val="0"/>
-          <w:iCs w:val="0"/>
-          <w:color w:val="4d555c"/>
-          <w:sz w:val="20"/>
-          <w:szCs w:val="20"/>
-          <w:rtl w:val="0"/>
-        </w:rPr>
-        <w:tab/>
-        <w:t xml:space="preserve">Jul.–Aug. 2026</w:t>
-      </w:r>
-      <w:r>
-        <w:rPr>
-          <w:rtl w:val="0"/>
-        </w:rPr>
-      </w:r>
-    </w:p>
-    <w:p>
-      <w:pPr>
-        <w:keepNext w:val="0"/>
-        <w:pageBreakBefore w:val="0"/>
-        <w:numPr>
-          <w:ilvl w:val="0"/>
-          <w:numId w:val="1"/>
-        </w:numPr>
-        <w:spacing w:after="4" w:before="0" w:line="235" w:lineRule="auto"/>
-        <w:ind w:left="122" w:hanging="122"/>
-        <w:rPr/>
-      </w:pPr>
-      <w:r>
-        <w:rPr>
-          <w:rFonts w:ascii="Calibri" w:cs="Calibri" w:eastAsia="Calibri" w:hAnsi="Calibri"/>
-          <w:b w:val="0"/>
-          <w:bCs w:val="0"/>
-          <w:i w:val="0"/>
-          <w:iCs w:val="0"/>
-          <w:sz w:val="20"/>
-          <w:szCs w:val="20"/>
-          <w:rtl w:val="0"/>
-        </w:rPr>
-        <w:t xml:space="preserve">Taught </w:t>
-      </w:r>
-      <w:r>
-        <w:rPr>
-          <w:rtl w:val="0"/>
-        </w:rPr>
-        <w:t xml:space="preserve">summer scholars </w:t>
-      </w:r>
-      <w:r>
-        <w:rPr>
-          <w:rFonts w:ascii="Calibri" w:cs="Calibri" w:eastAsia="Calibri" w:hAnsi="Calibri"/>
-          <w:b w:val="0"/>
-          <w:bCs w:val="0"/>
-          <w:i w:val="0"/>
-          <w:iCs w:val="0"/>
-          <w:sz w:val="20"/>
-          <w:szCs w:val="20"/>
-          <w:rtl w:val="0"/>
-        </w:rPr>
-        <w:t xml:space="preserve">to build machine-learning models and neural networks through hands-on programming.</w:t>
-      </w:r>
-      <w:r>
-        <w:rPr>
-          <w:rtl w:val="0"/>
-        </w:rPr>
-      </w:r>
-    </w:p>
-    <w:p>
-      <w:pPr>
-        <w:keepNext w:val="1"/>
-        <w:pageBreakBefore w:val="0"/>
-        <w:tabs>
-          <w:tab w:val="right" w:leader="none" w:pos="11606"/>
-        </w:tabs>
-        <w:spacing w:after="3" w:before="16" w:line="235" w:lineRule="auto"/>
-        <w:rPr/>
-      </w:pPr>
-      <w:r>
-        <w:rPr>
-          <w:rFonts w:ascii="Calibri" w:cs="Calibri" w:eastAsia="Calibri" w:hAnsi="Calibri"/>
-          <w:b w:val="1"/>
-          <w:bCs w:val="1"/>
-          <w:i w:val="0"/>
-          <w:iCs w:val="0"/>
-          <w:sz w:val="20"/>
-          <w:szCs w:val="20"/>
-          <w:rtl w:val="0"/>
-        </w:rPr>
-        <w:t xml:space="preserve">Cheer Up</w:t>
-      </w:r>
-      <w:r>
-        <w:rPr>
-          <w:rFonts w:ascii="Calibri" w:cs="Calibri" w:eastAsia="Calibri" w:hAnsi="Calibri"/>
-          <w:b w:val="0"/>
-          <w:bCs w:val="0"/>
-          <w:i w:val="0"/>
-          <w:iCs w:val="0"/>
-          <w:sz w:val="20"/>
-          <w:szCs w:val="20"/>
-          <w:rtl w:val="0"/>
-        </w:rPr>
-        <w:t xml:space="preserve"> | Outreach &amp; External Relations</w:t>
-      </w:r>
-      <w:r>
-        <w:rPr>
-          <w:rFonts w:ascii="Calibri" w:cs="Calibri" w:eastAsia="Calibri" w:hAnsi="Calibri"/>
-          <w:b w:val="0"/>
-          <w:bCs w:val="0"/>
-          <w:i w:val="0"/>
-          <w:iCs w:val="0"/>
-          <w:color w:val="4d555c"/>
-          <w:sz w:val="20"/>
-          <w:szCs w:val="20"/>
-          <w:rtl w:val="0"/>
-        </w:rPr>
-        <w:tab/>
-        <w:t xml:space="preserve">Oct. 2023–Apr. 2025</w:t>
-      </w:r>
-      <w:r>
-        <w:rPr>
-          <w:rtl w:val="0"/>
-        </w:rPr>
-      </w:r>
-    </w:p>
-    <w:p>
-      <w:pPr>
-        <w:keepNext w:val="0"/>
-        <w:pageBreakBefore w:val="0"/>
-        <w:numPr>
-          <w:ilvl w:val="0"/>
-          <w:numId w:val="1"/>
-        </w:numPr>
-        <w:spacing w:after="4" w:before="0" w:line="235" w:lineRule="auto"/>
-        <w:ind w:left="122" w:hanging="122"/>
-        <w:rPr/>
-      </w:pPr>
-      <w:r>
-        <w:rPr>
-          <w:rFonts w:ascii="Calibri" w:cs="Calibri" w:eastAsia="Calibri" w:hAnsi="Calibri"/>
-          <w:b w:val="0"/>
-          <w:bCs w:val="0"/>
-          <w:i w:val="0"/>
-          <w:iCs w:val="0"/>
-          <w:sz w:val="20"/>
-          <w:szCs w:val="20"/>
-          <w:rtl w:val="0"/>
-        </w:rPr>
-        <w:t xml:space="preserve">Accompanied young cancer patients and coordinated outreach for a student-run cancer-support association.</w:t>
-      </w:r>
-      <w:r>
-        <w:rPr>
-          <w:rtl w:val="0"/>
-        </w:rPr>
-      </w:r>
-    </w:p>
-    <w:p>
-      <w:pPr>
-        <w:keepNext w:val="1"/>
-        <w:pageBreakBefore w:val="0"/>
-        <w:spacing w:after="3" w:before="16" w:line="235" w:lineRule="auto"/>
-        <w:rPr/>
-      </w:pPr>
-      <w:r>
-        <w:rPr>
-          <w:rFonts w:ascii="Calibri" w:cs="Calibri" w:eastAsia="Calibri" w:hAnsi="Calibri"/>
-          <w:b w:val="1"/>
-          <w:bCs w:val="1"/>
-          <w:i w:val="0"/>
-          <w:iCs w:val="0"/>
-          <w:sz w:val="20"/>
-          <w:szCs w:val="20"/>
-          <w:rtl w:val="0"/>
-        </w:rPr>
-        <w:t xml:space="preserve">Mentoring &amp; Opération Monge:</w:t>
-      </w:r>
-      <w:r>
-        <w:rPr>
-          <w:rFonts w:ascii="Calibri" w:cs="Calibri" w:eastAsia="Calibri" w:hAnsi="Calibri"/>
-          <w:b w:val="0"/>
-          <w:bCs w:val="0"/>
-          <w:i w:val="0"/>
-          <w:iCs w:val="0"/>
-          <w:sz w:val="20"/>
-          <w:szCs w:val="20"/>
-          <w:rtl w:val="0"/>
-        </w:rPr>
-        <w:t xml:space="preserve"> Delivered presentations in underserved French high schools; provided one-to-one tutoring in mathematics and physics and university-application guidance to students in Burkina Faso, France and the U.S.</w:t>
-      </w:r>
-      <w:r>
-        <w:rPr>
-          <w:rtl w:val="0"/>
-        </w:rPr>
+        <w:t>Led trainee software engineers developing an AI tool to analyze leaked communications with police investigators; documented methods for new unit members.</w:t>
       </w:r>
     </w:p>
     <w:p>
@@ -2100,72 +958,41 @@
       <w:pPr>
         <w:keepNext w:val="0"/>
         <w:pageBreakBefore w:val="0"/>
-        <w:spacing w:after="4" w:before="0" w:line="235" w:lineRule="auto"/>
+        <w:spacing w:after="20" w:before="0" w:line="240" w:lineRule="auto"/>
         <w:rPr/>
       </w:pPr>
       <w:r>
         <w:rPr>
-          <w:rFonts w:ascii="Calibri" w:cs="Calibri" w:eastAsia="Calibri" w:hAnsi="Calibri"/>
-          <w:b w:val="1"/>
-          <w:bCs w:val="1"/>
-          <w:i w:val="0"/>
-          <w:iCs w:val="0"/>
+          <w:b/>
           <w:sz w:val="20"/>
-          <w:szCs w:val="20"/>
-          <w:rtl w:val="0"/>
         </w:rPr>
-        <w:t xml:space="preserve">Under review:</w:t>
+        <w:t>Under review:</w:t>
       </w:r>
       <w:r>
         <w:rPr>
-          <w:rFonts w:ascii="Calibri" w:cs="Calibri" w:eastAsia="Calibri" w:hAnsi="Calibri"/>
-          <w:b w:val="0"/>
-          <w:bCs w:val="0"/>
-          <w:i w:val="0"/>
-          <w:iCs w:val="0"/>
           <w:sz w:val="20"/>
-          <w:szCs w:val="20"/>
-          <w:rtl w:val="0"/>
         </w:rPr>
         <w:t xml:space="preserve"> Ghasimi, S. D., </w:t>
       </w:r>
       <w:r>
         <w:rPr>
-          <w:rFonts w:ascii="Calibri" w:cs="Calibri" w:eastAsia="Calibri" w:hAnsi="Calibri"/>
-          <w:b w:val="1"/>
-          <w:bCs w:val="1"/>
-          <w:i w:val="0"/>
-          <w:iCs w:val="0"/>
+          <w:b/>
           <w:sz w:val="20"/>
-          <w:szCs w:val="20"/>
-          <w:rtl w:val="0"/>
         </w:rPr>
-        <w:t xml:space="preserve">Poussi, E.</w:t>
+        <w:t>Poussi, E.</w:t>
       </w:r>
       <w:r>
         <w:rPr>
-          <w:rFonts w:ascii="Calibri" w:cs="Calibri" w:eastAsia="Calibri" w:hAnsi="Calibri"/>
-          <w:b w:val="0"/>
-          <w:bCs w:val="0"/>
-          <w:i w:val="0"/>
-          <w:iCs w:val="0"/>
           <w:sz w:val="20"/>
-          <w:szCs w:val="20"/>
-          <w:rtl w:val="0"/>
         </w:rPr>
-        <w:t xml:space="preserve">, Rabinovitch, J. “Surrogate-Based Optimization of Broadcloth Fabric Permeability for Mars Landing Parachute Simulations.” Submitted March 2026; reviews received August 2026; revision in progress.</w:t>
-      </w:r>
-      <w:r>
-        <w:rPr>
-          <w:rtl w:val="0"/>
-        </w:rPr>
+        <w:t>, Rabinovitch, J. “Surrogate-Based Optimization of Broadcloth Fabric Permeability for Mars Landing Parachute Simulations.” Revised manuscript submitted for final review, 2026.</w:t>
       </w:r>
     </w:p>
     <w:p>
       <w:pPr>
         <w:keepNext w:val="0"/>
         <w:pageBreakBefore w:val="0"/>
-        <w:spacing w:after="4" w:before="0" w:line="235" w:lineRule="auto"/>
+        <w:spacing w:after="20" w:before="0" w:line="240" w:lineRule="auto"/>
         <w:rPr/>
       </w:pPr>
       <w:r>
@@ -2241,6 +1068,7 @@
             <w:rtl w:val="0"/>
             <w:color w:val="0563C1"/>
             <w:u w:val="single"/>
+            <w:u w:val="single"/>
           </w:rPr>
           <w:t xml:space="preserve">doi:10.64898/2026.02.26.707870</w:t>
         </w:r>
@@ -2264,310 +1092,31 @@
       </w:pPr>
       <w:r>
         <w:rPr>
-          <w:rFonts w:ascii="Calibri" w:cs="Calibri" w:eastAsia="Calibri" w:hAnsi="Calibri"/>
-          <w:sz w:val="21"/>
-          <w:szCs w:val="21"/>
-          <w:rtl w:val="0"/>
+          <w:b/>
+          <w:sz w:val="20"/>
         </w:rPr>
-        <w:t xml:space="preserve">AWARDS &amp; DISTINCTIONS</w:t>
-      </w:r>
-      <w:r>
-        <w:rPr>
-          <w:rtl w:val="0"/>
-        </w:rPr>
+        <w:t>TECHNICAL SKILLS &amp; LANGUAGES</w:t>
       </w:r>
     </w:p>
     <w:p>
       <w:pPr>
         <w:keepNext w:val="0"/>
         <w:pageBreakBefore w:val="0"/>
-        <w:spacing w:after="2" w:before="0" w:line="235" w:lineRule="auto"/>
+        <w:spacing w:after="20" w:before="0" w:line="240" w:lineRule="auto"/>
         <w:rPr/>
       </w:pPr>
       <w:r>
         <w:rPr>
-          <w:rFonts w:ascii="Calibri" w:cs="Calibri" w:eastAsia="Calibri" w:hAnsi="Calibri"/>
-          <w:b w:val="1"/>
-          <w:bCs w:val="1"/>
-          <w:i w:val="0"/>
-          <w:iCs w:val="0"/>
           <w:sz w:val="20"/>
-          <w:szCs w:val="20"/>
-          <w:rtl w:val="0"/>
         </w:rPr>
-        <w:t xml:space="preserve">French Government Excellence Fellowship (2022)</w:t>
-      </w:r>
-      <w:r>
-        <w:rPr>
-          <w:rFonts w:ascii="Calibri" w:cs="Calibri" w:eastAsia="Calibri" w:hAnsi="Calibri"/>
-          <w:b w:val="0"/>
-          <w:bCs w:val="0"/>
-          <w:i w:val="0"/>
-          <w:iCs w:val="0"/>
-          <w:sz w:val="20"/>
-          <w:szCs w:val="20"/>
-          <w:rtl w:val="0"/>
-        </w:rPr>
-        <w:t xml:space="preserve"> — French Embassy in Burkina Faso; awarded for École Polytechnique studies.</w:t>
-      </w:r>
-      <w:r>
-        <w:rPr>
-          <w:rtl w:val="0"/>
-        </w:rPr>
+        <w:t>Python, C/C++, PyTorch, ROS2, MuJoCo, ANSYS; reinforcement learning, imitation learning, perception, motion planning and control.</w:t>
       </w:r>
     </w:p>
     <w:p>
       <w:pPr>
         <w:keepNext w:val="0"/>
         <w:pageBreakBefore w:val="0"/>
-        <w:spacing w:after="2" w:before="0" w:line="235" w:lineRule="auto"/>
-        <w:rPr/>
-      </w:pPr>
-      <w:r>
-        <w:rPr>
-          <w:rFonts w:ascii="Calibri" w:cs="Calibri" w:eastAsia="Calibri" w:hAnsi="Calibri"/>
-          <w:b w:val="1"/>
-          <w:bCs w:val="1"/>
-          <w:i w:val="0"/>
-          <w:iCs w:val="0"/>
-          <w:sz w:val="20"/>
-          <w:szCs w:val="20"/>
-          <w:rtl w:val="0"/>
-        </w:rPr>
-        <w:t xml:space="preserve">Youth Olympiads, French Legion of Honor (SMLH) (2021)</w:t>
-      </w:r>
-      <w:r>
-        <w:rPr>
-          <w:rFonts w:ascii="Calibri" w:cs="Calibri" w:eastAsia="Calibri" w:hAnsi="Calibri"/>
-          <w:b w:val="0"/>
-          <w:bCs w:val="0"/>
-          <w:i w:val="0"/>
-          <w:iCs w:val="0"/>
-          <w:sz w:val="20"/>
-          <w:szCs w:val="20"/>
-          <w:rtl w:val="0"/>
-        </w:rPr>
-        <w:t xml:space="preserve"> — 2nd place; team competition in culture and civic engagement.</w:t>
-      </w:r>
-      <w:r>
-        <w:rPr>
-          <w:rtl w:val="0"/>
-        </w:rPr>
-      </w:r>
-    </w:p>
-    <w:p>
-      <w:pPr>
-        <w:keepNext w:val="0"/>
-        <w:pageBreakBefore w:val="0"/>
-        <w:spacing w:after="2" w:before="0" w:line="235" w:lineRule="auto"/>
-        <w:rPr/>
-      </w:pPr>
-      <w:r>
-        <w:rPr>
-          <w:rFonts w:ascii="Calibri" w:cs="Calibri" w:eastAsia="Calibri" w:hAnsi="Calibri"/>
-          <w:b w:val="1"/>
-          <w:bCs w:val="1"/>
-          <w:i w:val="0"/>
-          <w:iCs w:val="0"/>
-          <w:sz w:val="20"/>
-          <w:szCs w:val="20"/>
-          <w:rtl w:val="0"/>
-        </w:rPr>
-        <w:t xml:space="preserve">Burkina Faso baccalauréat (2020)</w:t>
-      </w:r>
-      <w:r>
-        <w:rPr>
-          <w:rFonts w:ascii="Calibri" w:cs="Calibri" w:eastAsia="Calibri" w:hAnsi="Calibri"/>
-          <w:b w:val="0"/>
-          <w:bCs w:val="0"/>
-          <w:i w:val="0"/>
-          <w:iCs w:val="0"/>
-          <w:sz w:val="20"/>
-          <w:szCs w:val="20"/>
-          <w:rtl w:val="0"/>
-        </w:rPr>
-        <w:t xml:space="preserve"> — ranked </w:t>
-      </w:r>
-      <w:r>
-        <w:rPr>
-          <w:rFonts w:ascii="Calibri" w:cs="Calibri" w:eastAsia="Calibri" w:hAnsi="Calibri"/>
-          <w:b w:val="1"/>
-          <w:bCs w:val="1"/>
-          <w:i w:val="0"/>
-          <w:iCs w:val="0"/>
-          <w:sz w:val="20"/>
-          <w:szCs w:val="20"/>
-          <w:rtl w:val="0"/>
-        </w:rPr>
-        <w:t xml:space="preserve">1st nationwide</w:t>
-      </w:r>
-      <w:r>
-        <w:rPr>
-          <w:rFonts w:ascii="Calibri" w:cs="Calibri" w:eastAsia="Calibri" w:hAnsi="Calibri"/>
-          <w:b w:val="0"/>
-          <w:bCs w:val="0"/>
-          <w:i w:val="0"/>
-          <w:iCs w:val="0"/>
-          <w:sz w:val="20"/>
-          <w:szCs w:val="20"/>
-          <w:rtl w:val="0"/>
-        </w:rPr>
-        <w:t xml:space="preserve"> in mathematics &amp; physical sciences (Series C); selected as spokesperson at the Presidency on behalf of students across Burkina Faso.</w:t>
-      </w:r>
-      <w:r>
-        <w:rPr>
-          <w:rtl w:val="0"/>
-        </w:rPr>
-      </w:r>
-    </w:p>
-    <w:p>
-      <w:pPr>
-        <w:keepNext w:val="0"/>
-        <w:pageBreakBefore w:val="0"/>
-        <w:spacing w:after="2" w:before="0" w:line="235" w:lineRule="auto"/>
-        <w:rPr/>
-      </w:pPr>
-      <w:r>
-        <w:rPr>
-          <w:rFonts w:ascii="Calibri" w:cs="Calibri" w:eastAsia="Calibri" w:hAnsi="Calibri"/>
-          <w:b w:val="1"/>
-          <w:bCs w:val="1"/>
-          <w:i w:val="0"/>
-          <w:iCs w:val="0"/>
-          <w:sz w:val="20"/>
-          <w:szCs w:val="20"/>
-          <w:rtl w:val="0"/>
-        </w:rPr>
-        <w:t xml:space="preserve">PMK Model Student Award (2020)</w:t>
-      </w:r>
-      <w:r>
-        <w:rPr>
-          <w:rFonts w:ascii="Calibri" w:cs="Calibri" w:eastAsia="Calibri" w:hAnsi="Calibri"/>
-          <w:b w:val="0"/>
-          <w:bCs w:val="0"/>
-          <w:i w:val="0"/>
-          <w:iCs w:val="0"/>
-          <w:sz w:val="20"/>
-          <w:szCs w:val="20"/>
-          <w:rtl w:val="0"/>
-        </w:rPr>
-        <w:t xml:space="preserve"> — Recognized academic achievement, exemplary conduct and school involvement.</w:t>
-      </w:r>
-      <w:r>
-        <w:rPr>
-          <w:rtl w:val="0"/>
-        </w:rPr>
-      </w:r>
-    </w:p>
-    <w:p>
-      <w:pPr>
-        <w:keepNext w:val="0"/>
-        <w:pageBreakBefore w:val="0"/>
-        <w:spacing w:after="2" w:before="0" w:line="235" w:lineRule="auto"/>
-        <w:rPr/>
-      </w:pPr>
-      <w:r>
-        <w:rPr>
-          <w:rFonts w:ascii="Calibri" w:cs="Calibri" w:eastAsia="Calibri" w:hAnsi="Calibri"/>
-          <w:b w:val="1"/>
-          <w:bCs w:val="1"/>
-          <w:i w:val="0"/>
-          <w:iCs w:val="0"/>
-          <w:sz w:val="20"/>
-          <w:szCs w:val="20"/>
-          <w:rtl w:val="0"/>
-        </w:rPr>
-        <w:t xml:space="preserve">PMK Excellence Awards (2018–2020)</w:t>
-      </w:r>
-      <w:r>
-        <w:rPr>
-          <w:rFonts w:ascii="Calibri" w:cs="Calibri" w:eastAsia="Calibri" w:hAnsi="Calibri"/>
-          <w:b w:val="0"/>
-          <w:bCs w:val="0"/>
-          <w:i w:val="0"/>
-          <w:iCs w:val="0"/>
-          <w:sz w:val="20"/>
-          <w:szCs w:val="20"/>
-          <w:rtl w:val="0"/>
-        </w:rPr>
-        <w:t xml:space="preserve"> — Highest academic score across all high-school grades, three consecutive years.</w:t>
-      </w:r>
-      <w:r>
-        <w:rPr>
-          <w:rtl w:val="0"/>
-        </w:rPr>
-      </w:r>
-    </w:p>
-    <w:p>
-      <w:pPr>
-        <w:pStyle w:val="Heading1"/>
-        <w:keepNext w:val="1"/>
-        <w:pageBreakBefore w:val="0"/>
-        <w:pBdr>
-          <w:bottom w:color="adbcc4" w:space="2" w:sz="4" w:val="single"/>
-        </w:pBdr>
-        <w:spacing w:after="20" w:before="49" w:line="240" w:lineRule="auto"/>
-        <w:rPr/>
-      </w:pPr>
-      <w:r>
-        <w:rPr>
-          <w:rFonts w:ascii="Calibri" w:cs="Calibri" w:eastAsia="Calibri" w:hAnsi="Calibri"/>
-          <w:sz w:val="21"/>
-          <w:szCs w:val="21"/>
-          <w:rtl w:val="0"/>
-        </w:rPr>
-        <w:t xml:space="preserve">SKILLS &amp; INTERESTS</w:t>
-      </w:r>
-      <w:r>
-        <w:rPr>
-          <w:rtl w:val="0"/>
-        </w:rPr>
-      </w:r>
-    </w:p>
-    <w:p>
-      <w:pPr>
-        <w:keepNext w:val="0"/>
-        <w:pageBreakBefore w:val="0"/>
-        <w:spacing w:after="2" w:before="0" w:line="235" w:lineRule="auto"/>
-        <w:rPr/>
-      </w:pPr>
-      <w:r>
-        <w:rPr>
-          <w:rFonts w:ascii="Calibri" w:cs="Calibri" w:eastAsia="Calibri" w:hAnsi="Calibri"/>
-          <w:b w:val="1"/>
-          <w:bCs w:val="1"/>
-          <w:i w:val="0"/>
-          <w:iCs w:val="0"/>
-          <w:sz w:val="20"/>
-          <w:szCs w:val="20"/>
-          <w:rtl w:val="0"/>
-        </w:rPr>
-        <w:t xml:space="preserve">Technical:</w:t>
-      </w:r>
-      <w:r>
-        <w:rPr>
-          <w:rFonts w:ascii="Calibri" w:cs="Calibri" w:eastAsia="Calibri" w:hAnsi="Calibri"/>
-          <w:b w:val="0"/>
-          <w:bCs w:val="0"/>
-          <w:i w:val="0"/>
-          <w:iCs w:val="0"/>
-          <w:sz w:val="20"/>
-          <w:szCs w:val="20"/>
-          <w:rtl w:val="0"/>
-        </w:rPr>
-        <w:t xml:space="preserve"> Python, C/C++, PyTorch, ROS2, MuJoCo, ANSYS; reinforcement learning, perception and control.</w:t>
-      </w:r>
-      <w:r>
-        <w:rPr>
-          <w:rtl w:val="0"/>
-        </w:rPr>
-      </w:r>
-    </w:p>
-    <w:p>
-      <w:pPr>
-        <w:keepNext w:val="0"/>
-        <w:pageBreakBefore w:val="0"/>
-        <w:spacing w:after="2" w:before="0" w:line="235" w:lineRule="auto"/>
+        <w:spacing w:after="20" w:before="0" w:line="240" w:lineRule="auto"/>
         <w:rPr/>
       </w:pPr>
       <w:r>
@@ -2604,46 +1153,130 @@
     </w:p>
     <w:p>
       <w:pPr>
-        <w:keepNext w:val="0"/>
+        <w:pStyle w:val="Heading1"/>
+        <w:keepNext w:val="1"/>
         <w:pageBreakBefore w:val="0"/>
-        <w:spacing w:after="2" w:before="0" w:line="235" w:lineRule="auto"/>
+        <w:pBdr>
+          <w:bottom w:color="adbcc4" w:space="2" w:sz="4" w:val="single"/>
+        </w:pBdr>
+        <w:spacing w:after="20" w:before="49" w:line="240" w:lineRule="auto"/>
         <w:rPr/>
       </w:pPr>
       <w:r>
         <w:rPr>
-          <w:rFonts w:ascii="Calibri" w:cs="Calibri" w:eastAsia="Calibri" w:hAnsi="Calibri"/>
-          <w:b w:val="1"/>
-          <w:bCs w:val="1"/>
-          <w:i w:val="0"/>
-          <w:iCs w:val="0"/>
+          <w:b/>
           <w:sz w:val="20"/>
-          <w:szCs w:val="20"/>
-          <w:rtl w:val="0"/>
         </w:rPr>
-        <w:t xml:space="preserve">Interests:</w:t>
+        <w:t>LEADERSHIP &amp; DISTINCTIONS</w:t>
+      </w:r>
+    </w:p>
+    <w:p>
+      <w:pPr>
+        <w:keepNext w:val="0"/>
+        <w:pageBreakBefore w:val="0"/>
+        <w:spacing w:after="20" w:before="0" w:line="240" w:lineRule="auto"/>
+        <w:ind w:left="122" w:hanging="122"/>
+        <w:rPr/>
+      </w:pPr>
+      <w:r>
+        <w:rPr>
+          <w:b/>
+          <w:sz w:val="20"/>
+        </w:rPr>
+        <w:t>Stanford BGSA</w:t>
       </w:r>
       <w:r>
         <w:rPr>
-          <w:rFonts w:ascii="Calibri" w:cs="Calibri" w:eastAsia="Calibri" w:hAnsi="Calibri"/>
-          <w:b w:val="0"/>
-          <w:bCs w:val="0"/>
-          <w:i w:val="0"/>
-          <w:iCs w:val="0"/>
           <w:sz w:val="20"/>
-          <w:szCs w:val="20"/>
-          <w:rtl w:val="0"/>
         </w:rPr>
-        <w:t xml:space="preserve"> Handball (French intercollegiate competition), strength training, drawing and painting; geopolitics in Africa.</w:t>
+        <w:t xml:space="preserve"> Fundraising Chair: raised $3,000+ toward a $10,000+ team effort. </w:t>
       </w:r>
       <w:r>
         <w:rPr>
-          <w:rtl w:val="0"/>
+          <w:b/>
+          <w:sz w:val="20"/>
         </w:rPr>
+        <w:t>Inspirit AI</w:t>
+      </w:r>
+      <w:r>
+        <w:rPr>
+          <w:sz w:val="20"/>
+        </w:rPr>
+        <w:t xml:space="preserve"> Instructor: taught hands-on machine learning and neural networks (2026).</w:t>
+      </w:r>
+    </w:p>
+    <w:p>
+      <w:pPr>
+        <w:keepNext w:val="0"/>
+        <w:pageBreakBefore w:val="0"/>
+        <w:spacing w:after="20" w:before="0" w:line="240" w:lineRule="auto"/>
+        <w:ind w:left="122" w:hanging="122"/>
+        <w:rPr/>
+      </w:pPr>
+      <w:r>
+        <w:rPr>
+          <w:b/>
+          <w:sz w:val="20"/>
+        </w:rPr>
+        <w:t>Cheer Up:</w:t>
+      </w:r>
+      <w:r>
+        <w:rPr>
+          <w:sz w:val="20"/>
+        </w:rPr>
+        <w:t xml:space="preserve"> supported young cancer patients. </w:t>
+      </w:r>
+      <w:r>
+        <w:rPr>
+          <w:b/>
+          <w:sz w:val="20"/>
+        </w:rPr>
+        <w:t>Mentoring:</w:t>
+      </w:r>
+      <w:r>
+        <w:rPr>
+          <w:sz w:val="20"/>
+        </w:rPr>
+        <w:t xml:space="preserve"> mathematics, physics and university-application guidance for students in Burkina Faso, France and the U.S.</w:t>
+      </w:r>
+    </w:p>
+    <w:p>
+      <w:pPr>
+        <w:keepNext w:val="0"/>
+        <w:pageBreakBefore w:val="0"/>
+        <w:spacing w:after="20" w:before="0" w:line="240" w:lineRule="auto"/>
+        <w:rPr/>
+      </w:pPr>
+      <w:r>
+        <w:rPr>
+          <w:b/>
+          <w:sz w:val="20"/>
+        </w:rPr>
+        <w:t>French Government Excellence Fellowship</w:t>
+      </w:r>
+      <w:r>
+        <w:rPr>
+          <w:sz w:val="20"/>
+        </w:rPr>
+        <w:t xml:space="preserve"> (2022); </w:t>
+      </w:r>
+      <w:r>
+        <w:rPr>
+          <w:b/>
+          <w:sz w:val="20"/>
+        </w:rPr>
+        <w:t>1st nationwide</w:t>
+      </w:r>
+      <w:r>
+        <w:rPr>
+          <w:sz w:val="20"/>
+        </w:rPr>
+        <w:t xml:space="preserve"> in Burkina Faso’s mathematics &amp; physical sciences baccalauréat (2020).</w:t>
       </w:r>
     </w:p>
     <w:sectPr>
       <w:pgSz w:h="15840" w:w="12240" w:orient="portrait"/>
-      <w:pgMar w:bottom="230" w:top="274" w:left="317" w:right="317" w:header="216" w:footer="216"/>
+      <w:pgMar w:bottom="504" w:top="504" w:left="504" w:right="504" w:header="216" w:footer="216"/>
       <w:pgNumType w:start="1"/>
     </w:sectPr>
   </w:body>

</xml_diff>